<commit_message>
added a settings page
</commit_message>
<xml_diff>
--- a/public/doc-templates/KP/kelayakan-kp.docx
+++ b/public/doc-templates/KP/kelayakan-kp.docx
@@ -4,19 +4,6 @@
   <w:body>
     <w:p>
       <w:pPr>
-        <w:widowControl w:val="0"/>
-        <w:pBdr>
-          <w:top w:val="nil"/>
-          <w:left w:val="nil"/>
-          <w:bottom w:val="nil"/>
-          <w:right w:val="nil"/>
-          <w:between w:val="nil"/>
-        </w:pBdr>
-        <w:spacing w:after="0" w:line="276" w:lineRule="auto"/>
-      </w:pPr>
-    </w:p>
-    <w:p>
-      <w:pPr>
         <w:tabs>
           <w:tab w:val="left" w:pos="0"/>
         </w:tabs>
@@ -59,77 +46,13 @@
           <w:tab w:val="left" w:pos="0"/>
         </w:tabs>
         <w:spacing w:after="0"/>
-        <w:jc w:val="both"/>
-        <w:rPr>
-          <w:rFonts w:ascii="Times New Roman" w:eastAsia="Times New Roman" w:hAnsi="Times New Roman" w:cs="Times New Roman"/>
-          <w:sz w:val="24"/>
-          <w:szCs w:val="24"/>
-        </w:rPr>
-      </w:pPr>
-      <w:proofErr w:type="spellStart"/>
-      <w:r>
-        <w:rPr>
-          <w:rFonts w:ascii="Times New Roman" w:eastAsia="Times New Roman" w:hAnsi="Times New Roman" w:cs="Times New Roman"/>
-          <w:sz w:val="24"/>
-          <w:szCs w:val="24"/>
-        </w:rPr>
-        <w:t>Menerangkan</w:t>
-      </w:r>
-      <w:proofErr w:type="spellEnd"/>
-      <w:r>
-        <w:rPr>
-          <w:rFonts w:ascii="Times New Roman" w:eastAsia="Times New Roman" w:hAnsi="Times New Roman" w:cs="Times New Roman"/>
-          <w:sz w:val="24"/>
-          <w:szCs w:val="24"/>
-        </w:rPr>
-        <w:t xml:space="preserve"> </w:t>
-      </w:r>
-      <w:proofErr w:type="spellStart"/>
-      <w:r>
-        <w:rPr>
-          <w:rFonts w:ascii="Times New Roman" w:eastAsia="Times New Roman" w:hAnsi="Times New Roman" w:cs="Times New Roman"/>
-          <w:sz w:val="24"/>
-          <w:szCs w:val="24"/>
-        </w:rPr>
-        <w:t>bahwa</w:t>
-      </w:r>
-      <w:proofErr w:type="spellEnd"/>
-      <w:r>
-        <w:rPr>
-          <w:rFonts w:ascii="Times New Roman" w:eastAsia="Times New Roman" w:hAnsi="Times New Roman" w:cs="Times New Roman"/>
-          <w:sz w:val="24"/>
-          <w:szCs w:val="24"/>
-        </w:rPr>
-        <w:t xml:space="preserve"> </w:t>
-      </w:r>
-      <w:proofErr w:type="spellStart"/>
-      <w:r>
-        <w:rPr>
-          <w:rFonts w:ascii="Times New Roman" w:eastAsia="Times New Roman" w:hAnsi="Times New Roman" w:cs="Times New Roman"/>
-          <w:sz w:val="24"/>
-          <w:szCs w:val="24"/>
-        </w:rPr>
-        <w:t>mahasiswa</w:t>
-      </w:r>
-      <w:proofErr w:type="spellEnd"/>
-      <w:r>
-        <w:rPr>
-          <w:rFonts w:ascii="Times New Roman" w:eastAsia="Times New Roman" w:hAnsi="Times New Roman" w:cs="Times New Roman"/>
-          <w:sz w:val="24"/>
-          <w:szCs w:val="24"/>
-        </w:rPr>
-        <w:t xml:space="preserve"> </w:t>
-      </w:r>
-      <w:proofErr w:type="spellStart"/>
-      <w:r>
-        <w:rPr>
-          <w:rFonts w:ascii="Times New Roman" w:eastAsia="Times New Roman" w:hAnsi="Times New Roman" w:cs="Times New Roman"/>
-          <w:sz w:val="24"/>
-          <w:szCs w:val="24"/>
-        </w:rPr>
-        <w:t>berikut</w:t>
-      </w:r>
-      <w:proofErr w:type="spellEnd"/>
+        <w:jc w:val="center"/>
+        <w:rPr>
+          <w:rFonts w:ascii="Times New Roman" w:eastAsia="Times New Roman" w:hAnsi="Times New Roman" w:cs="Times New Roman"/>
+          <w:sz w:val="24"/>
+          <w:szCs w:val="24"/>
+        </w:rPr>
+      </w:pPr>
     </w:p>
     <w:p>
       <w:pPr>
@@ -144,6 +67,83 @@
           <w:szCs w:val="24"/>
         </w:rPr>
       </w:pPr>
+      <w:proofErr w:type="spellStart"/>
+      <w:r>
+        <w:rPr>
+          <w:rFonts w:ascii="Times New Roman" w:eastAsia="Times New Roman" w:hAnsi="Times New Roman" w:cs="Times New Roman"/>
+          <w:sz w:val="24"/>
+          <w:szCs w:val="24"/>
+        </w:rPr>
+        <w:t>Menerangkan</w:t>
+      </w:r>
+      <w:proofErr w:type="spellEnd"/>
+      <w:r>
+        <w:rPr>
+          <w:rFonts w:ascii="Times New Roman" w:eastAsia="Times New Roman" w:hAnsi="Times New Roman" w:cs="Times New Roman"/>
+          <w:sz w:val="24"/>
+          <w:szCs w:val="24"/>
+        </w:rPr>
+        <w:t xml:space="preserve"> </w:t>
+      </w:r>
+      <w:proofErr w:type="spellStart"/>
+      <w:r>
+        <w:rPr>
+          <w:rFonts w:ascii="Times New Roman" w:eastAsia="Times New Roman" w:hAnsi="Times New Roman" w:cs="Times New Roman"/>
+          <w:sz w:val="24"/>
+          <w:szCs w:val="24"/>
+        </w:rPr>
+        <w:t>bahwa</w:t>
+      </w:r>
+      <w:proofErr w:type="spellEnd"/>
+      <w:r>
+        <w:rPr>
+          <w:rFonts w:ascii="Times New Roman" w:eastAsia="Times New Roman" w:hAnsi="Times New Roman" w:cs="Times New Roman"/>
+          <w:sz w:val="24"/>
+          <w:szCs w:val="24"/>
+        </w:rPr>
+        <w:t xml:space="preserve"> </w:t>
+      </w:r>
+      <w:proofErr w:type="spellStart"/>
+      <w:r>
+        <w:rPr>
+          <w:rFonts w:ascii="Times New Roman" w:eastAsia="Times New Roman" w:hAnsi="Times New Roman" w:cs="Times New Roman"/>
+          <w:sz w:val="24"/>
+          <w:szCs w:val="24"/>
+        </w:rPr>
+        <w:t>mahasiswa</w:t>
+      </w:r>
+      <w:proofErr w:type="spellEnd"/>
+      <w:r>
+        <w:rPr>
+          <w:rFonts w:ascii="Times New Roman" w:eastAsia="Times New Roman" w:hAnsi="Times New Roman" w:cs="Times New Roman"/>
+          <w:sz w:val="24"/>
+          <w:szCs w:val="24"/>
+        </w:rPr>
+        <w:t xml:space="preserve"> </w:t>
+      </w:r>
+      <w:proofErr w:type="spellStart"/>
+      <w:r>
+        <w:rPr>
+          <w:rFonts w:ascii="Times New Roman" w:eastAsia="Times New Roman" w:hAnsi="Times New Roman" w:cs="Times New Roman"/>
+          <w:sz w:val="24"/>
+          <w:szCs w:val="24"/>
+        </w:rPr>
+        <w:t>berikut</w:t>
+      </w:r>
+      <w:proofErr w:type="spellEnd"/>
+    </w:p>
+    <w:p>
+      <w:pPr>
+        <w:tabs>
+          <w:tab w:val="left" w:pos="0"/>
+        </w:tabs>
+        <w:spacing w:after="0"/>
+        <w:rPr>
+          <w:rFonts w:ascii="Times New Roman" w:eastAsia="Times New Roman" w:hAnsi="Times New Roman" w:cs="Times New Roman"/>
+          <w:sz w:val="24"/>
+          <w:szCs w:val="24"/>
+        </w:rPr>
+      </w:pPr>
       <w:r>
         <w:rPr>
           <w:rFonts w:ascii="Times New Roman" w:eastAsia="Times New Roman" w:hAnsi="Times New Roman" w:cs="Times New Roman"/>
@@ -159,15 +159,7 @@
           <w:szCs w:val="24"/>
         </w:rPr>
         <w:tab/>
-        <w:t xml:space="preserve">: </w:t>
-      </w:r>
-      <w:r>
-        <w:rPr>
-          <w:rFonts w:ascii="Times New Roman" w:eastAsia="Times New Roman" w:hAnsi="Times New Roman" w:cs="Times New Roman"/>
-          <w:sz w:val="24"/>
-          <w:szCs w:val="24"/>
-        </w:rPr>
-        <w:t>{</w:t>
+        <w:t>: {</w:t>
       </w:r>
       <w:proofErr w:type="spellStart"/>
       <w:r>
@@ -186,6 +178,36 @@
           <w:szCs w:val="24"/>
         </w:rPr>
         <w:t>}</w:t>
+      </w:r>
+    </w:p>
+    <w:p>
+      <w:pPr>
+        <w:tabs>
+          <w:tab w:val="left" w:pos="0"/>
+        </w:tabs>
+        <w:spacing w:after="0"/>
+        <w:rPr>
+          <w:rFonts w:ascii="Times New Roman" w:eastAsia="Times New Roman" w:hAnsi="Times New Roman" w:cs="Times New Roman"/>
+          <w:sz w:val="24"/>
+          <w:szCs w:val="24"/>
+        </w:rPr>
+      </w:pPr>
+      <w:r>
+        <w:rPr>
+          <w:rFonts w:ascii="Times New Roman" w:eastAsia="Times New Roman" w:hAnsi="Times New Roman" w:cs="Times New Roman"/>
+          <w:sz w:val="24"/>
+          <w:szCs w:val="24"/>
+        </w:rPr>
+        <w:t>NIM</w:t>
+      </w:r>
+      <w:r>
+        <w:rPr>
+          <w:rFonts w:ascii="Times New Roman" w:eastAsia="Times New Roman" w:hAnsi="Times New Roman" w:cs="Times New Roman"/>
+          <w:sz w:val="24"/>
+          <w:szCs w:val="24"/>
+        </w:rPr>
+        <w:tab/>
+        <w:t>: {nim}</w:t>
       </w:r>
     </w:p>
     <w:p>
@@ -201,31 +223,6 @@
           <w:szCs w:val="24"/>
         </w:rPr>
       </w:pPr>
-      <w:r>
-        <w:rPr>
-          <w:rFonts w:ascii="Times New Roman" w:eastAsia="Times New Roman" w:hAnsi="Times New Roman" w:cs="Times New Roman"/>
-          <w:sz w:val="24"/>
-          <w:szCs w:val="24"/>
-        </w:rPr>
-        <w:t>NIM</w:t>
-      </w:r>
-      <w:r>
-        <w:rPr>
-          <w:rFonts w:ascii="Times New Roman" w:eastAsia="Times New Roman" w:hAnsi="Times New Roman" w:cs="Times New Roman"/>
-          <w:sz w:val="24"/>
-          <w:szCs w:val="24"/>
-        </w:rPr>
-        <w:tab/>
-        <w:t xml:space="preserve">: </w:t>
-      </w:r>
-      <w:r>
-        <w:rPr>
-          <w:rFonts w:ascii="Times New Roman" w:eastAsia="Times New Roman" w:hAnsi="Times New Roman" w:cs="Times New Roman"/>
-          <w:sz w:val="24"/>
-          <w:szCs w:val="24"/>
-        </w:rPr>
-        <w:t>{nim}</w:t>
-      </w:r>
     </w:p>
     <w:p>
       <w:pPr>
@@ -240,62 +237,6 @@
           <w:szCs w:val="24"/>
         </w:rPr>
       </w:pPr>
-      <w:r>
-        <w:rPr>
-          <w:rFonts w:ascii="Times New Roman" w:eastAsia="Times New Roman" w:hAnsi="Times New Roman" w:cs="Times New Roman"/>
-          <w:sz w:val="24"/>
-          <w:szCs w:val="24"/>
-        </w:rPr>
-        <w:tab/>
-      </w:r>
-      <w:r>
-        <w:rPr>
-          <w:rFonts w:ascii="Times New Roman" w:eastAsia="Times New Roman" w:hAnsi="Times New Roman" w:cs="Times New Roman"/>
-          <w:sz w:val="24"/>
-          <w:szCs w:val="24"/>
-        </w:rPr>
-        <w:tab/>
-      </w:r>
-      <w:r>
-        <w:rPr>
-          <w:rFonts w:ascii="Times New Roman" w:eastAsia="Times New Roman" w:hAnsi="Times New Roman" w:cs="Times New Roman"/>
-          <w:sz w:val="24"/>
-          <w:szCs w:val="24"/>
-        </w:rPr>
-        <w:tab/>
-      </w:r>
-      <w:r>
-        <w:rPr>
-          <w:rFonts w:ascii="Times New Roman" w:eastAsia="Times New Roman" w:hAnsi="Times New Roman" w:cs="Times New Roman"/>
-          <w:sz w:val="24"/>
-          <w:szCs w:val="24"/>
-        </w:rPr>
-        <w:tab/>
-      </w:r>
-      <w:r>
-        <w:rPr>
-          <w:rFonts w:ascii="Times New Roman" w:eastAsia="Times New Roman" w:hAnsi="Times New Roman" w:cs="Times New Roman"/>
-          <w:sz w:val="24"/>
-          <w:szCs w:val="24"/>
-        </w:rPr>
-        <w:tab/>
-      </w:r>
-      <w:r>
-        <w:rPr>
-          <w:rFonts w:ascii="Times New Roman" w:eastAsia="Times New Roman" w:hAnsi="Times New Roman" w:cs="Times New Roman"/>
-          <w:sz w:val="24"/>
-          <w:szCs w:val="24"/>
-        </w:rPr>
-        <w:tab/>
-      </w:r>
-      <w:r>
-        <w:rPr>
-          <w:rFonts w:ascii="Times New Roman" w:eastAsia="Times New Roman" w:hAnsi="Times New Roman" w:cs="Times New Roman"/>
-          <w:sz w:val="24"/>
-          <w:szCs w:val="24"/>
-        </w:rPr>
-        <w:tab/>
-      </w:r>
     </w:p>
     <w:p>
       <w:pPr>
@@ -303,7 +244,6 @@
           <w:tab w:val="left" w:pos="0"/>
         </w:tabs>
         <w:spacing w:after="0"/>
-        <w:jc w:val="both"/>
         <w:rPr>
           <w:rFonts w:ascii="Times New Roman" w:eastAsia="Times New Roman" w:hAnsi="Times New Roman" w:cs="Times New Roman"/>
           <w:sz w:val="24"/>
@@ -542,7 +482,6 @@
           <w:tab w:val="left" w:pos="0"/>
         </w:tabs>
         <w:spacing w:after="0"/>
-        <w:jc w:val="both"/>
         <w:rPr>
           <w:rFonts w:ascii="Times New Roman" w:eastAsia="Times New Roman" w:hAnsi="Times New Roman" w:cs="Times New Roman"/>
           <w:sz w:val="24"/>
@@ -556,7 +495,6 @@
           <w:tab w:val="left" w:pos="630"/>
         </w:tabs>
         <w:spacing w:after="0"/>
-        <w:jc w:val="both"/>
         <w:rPr>
           <w:rFonts w:ascii="Times New Roman" w:eastAsia="Times New Roman" w:hAnsi="Times New Roman" w:cs="Times New Roman"/>
           <w:sz w:val="24"/>
@@ -569,45 +507,23 @@
           <w:id w:val="-1609885480"/>
         </w:sdtPr>
         <w:sdtContent>
+          <w:proofErr w:type="gramStart"/>
           <w:r>
             <w:rPr>
               <w:rFonts w:ascii="Gungsuh" w:eastAsia="Gungsuh" w:hAnsi="Gungsuh" w:cs="Gungsuh"/>
               <w:sz w:val="24"/>
               <w:szCs w:val="24"/>
             </w:rPr>
-            <w:t xml:space="preserve">[ ] SKS ≥ 90 SKS = </w:t>
+            <w:t>[ ]</w:t>
           </w:r>
+          <w:proofErr w:type="gramEnd"/>
           <w:r>
             <w:rPr>
               <w:rFonts w:ascii="Gungsuh" w:eastAsia="Gungsuh" w:hAnsi="Gungsuh" w:cs="Gungsuh"/>
               <w:sz w:val="24"/>
               <w:szCs w:val="24"/>
             </w:rPr>
-            <w:t>(</w:t>
-          </w:r>
-          <w:r>
-            <w:rPr>
-              <w:rFonts w:ascii="Gungsuh" w:eastAsia="Gungsuh" w:hAnsi="Gungsuh" w:cs="Gungsuh"/>
-              <w:sz w:val="24"/>
-              <w:szCs w:val="24"/>
-            </w:rPr>
-            <w:t>Telah lulus SKS ≥ 90 SKS</w:t>
-          </w:r>
-          <w:r>
-            <w:rPr>
-              <w:rFonts w:ascii="Gungsuh" w:eastAsia="Gungsuh" w:hAnsi="Gungsuh" w:cs="Gungsuh"/>
-              <w:sz w:val="24"/>
-              <w:szCs w:val="24"/>
-            </w:rPr>
-            <w:t>)</w:t>
-          </w:r>
-          <w:r>
-            <w:rPr>
-              <w:rFonts w:ascii="Gungsuh" w:eastAsia="Gungsuh" w:hAnsi="Gungsuh" w:cs="Gungsuh"/>
-              <w:sz w:val="24"/>
-              <w:szCs w:val="24"/>
-            </w:rPr>
-            <w:t xml:space="preserve"> SKS</w:t>
+            <w:t xml:space="preserve"> SKS ≥ 90 SKS = (Telah lulus SKS ≥ 90 SKS) SKS</w:t>
           </w:r>
         </w:sdtContent>
       </w:sdt>
@@ -619,7 +535,6 @@
         </w:tabs>
         <w:spacing w:after="0"/>
         <w:ind w:left="709" w:hanging="78"/>
-        <w:jc w:val="both"/>
         <w:rPr>
           <w:rFonts w:ascii="Times New Roman" w:eastAsia="Times New Roman" w:hAnsi="Times New Roman" w:cs="Times New Roman"/>
           <w:sz w:val="24"/>
@@ -634,7 +549,6 @@
         </w:tabs>
         <w:spacing w:after="0"/>
         <w:ind w:left="709" w:hanging="78"/>
-        <w:jc w:val="both"/>
         <w:rPr>
           <w:rFonts w:ascii="Times New Roman" w:eastAsia="Times New Roman" w:hAnsi="Times New Roman" w:cs="Times New Roman"/>
           <w:sz w:val="24"/>
@@ -712,7 +626,6 @@
         </w:tabs>
         <w:spacing w:after="0"/>
         <w:ind w:left="709" w:hanging="78"/>
-        <w:jc w:val="both"/>
         <w:rPr>
           <w:rFonts w:ascii="Times New Roman" w:eastAsia="Times New Roman" w:hAnsi="Times New Roman" w:cs="Times New Roman"/>
           <w:sz w:val="24"/>
@@ -727,7 +640,6 @@
           <w:tab w:val="left" w:pos="2880"/>
         </w:tabs>
         <w:spacing w:after="0"/>
-        <w:jc w:val="both"/>
         <w:rPr>
           <w:rFonts w:ascii="Times New Roman" w:eastAsia="Times New Roman" w:hAnsi="Times New Roman" w:cs="Times New Roman"/>
           <w:sz w:val="24"/>
@@ -740,29 +652,41 @@
           <w:id w:val="1925373695"/>
         </w:sdtPr>
         <w:sdtContent>
+          <w:proofErr w:type="gramStart"/>
           <w:r>
             <w:rPr>
               <w:rFonts w:ascii="Gungsuh" w:eastAsia="Gungsuh" w:hAnsi="Gungsuh" w:cs="Gungsuh"/>
               <w:sz w:val="24"/>
               <w:szCs w:val="24"/>
             </w:rPr>
-            <w:t xml:space="preserve">[ ] SKS ≥ 20 SKS = </w:t>
+            <w:t>[ ]</w:t>
           </w:r>
+          <w:proofErr w:type="gramEnd"/>
           <w:r>
             <w:rPr>
               <w:rFonts w:ascii="Gungsuh" w:eastAsia="Gungsuh" w:hAnsi="Gungsuh" w:cs="Gungsuh"/>
               <w:sz w:val="24"/>
               <w:szCs w:val="24"/>
             </w:rPr>
-            <w:t xml:space="preserve">( </w:t>
+            <w:t xml:space="preserve"> SKS ≥ 20 SKS = </w:t>
           </w:r>
+          <w:proofErr w:type="gramStart"/>
           <w:r>
             <w:rPr>
               <w:rFonts w:ascii="Gungsuh" w:eastAsia="Gungsuh" w:hAnsi="Gungsuh" w:cs="Gungsuh"/>
               <w:sz w:val="24"/>
               <w:szCs w:val="24"/>
             </w:rPr>
-            <w:t>Sedang/</w:t>
+            <w:t>( Sedang</w:t>
+          </w:r>
+          <w:proofErr w:type="gramEnd"/>
+          <w:r>
+            <w:rPr>
+              <w:rFonts w:ascii="Gungsuh" w:eastAsia="Gungsuh" w:hAnsi="Gungsuh" w:cs="Gungsuh"/>
+              <w:sz w:val="24"/>
+              <w:szCs w:val="24"/>
+            </w:rPr>
+            <w:t>/</w:t>
           </w:r>
           <w:proofErr w:type="spellStart"/>
           <w:r>
@@ -798,32 +722,25 @@
               <w:sz w:val="24"/>
               <w:szCs w:val="24"/>
             </w:rPr>
-            <w:t xml:space="preserve"> ≥ 20 SKS </w:t>
+            <w:t xml:space="preserve"> ≥ 20 </w:t>
           </w:r>
+          <w:proofErr w:type="gramStart"/>
           <w:r>
             <w:rPr>
               <w:rFonts w:ascii="Gungsuh" w:eastAsia="Gungsuh" w:hAnsi="Gungsuh" w:cs="Gungsuh"/>
               <w:sz w:val="24"/>
               <w:szCs w:val="24"/>
             </w:rPr>
-            <w:t>)</w:t>
+            <w:t>SKS )</w:t>
           </w:r>
+          <w:proofErr w:type="gramEnd"/>
           <w:r>
             <w:rPr>
               <w:rFonts w:ascii="Gungsuh" w:eastAsia="Gungsuh" w:hAnsi="Gungsuh" w:cs="Gungsuh"/>
               <w:sz w:val="24"/>
               <w:szCs w:val="24"/>
             </w:rPr>
-            <w:t xml:space="preserve"> SKS</w:t>
-          </w:r>
-          <w:r>
-            <w:rPr>
-              <w:rFonts w:ascii="Gungsuh" w:eastAsia="Gungsuh" w:hAnsi="Gungsuh" w:cs="Gungsuh"/>
-              <w:sz w:val="24"/>
-              <w:szCs w:val="24"/>
-            </w:rPr>
-            <w:tab/>
-            <w:t xml:space="preserve">di </w:t>
+            <w:t xml:space="preserve"> SKS di </w:t>
           </w:r>
           <w:proofErr w:type="spellStart"/>
           <w:r>
@@ -899,7 +816,7 @@
           <w:sz w:val="24"/>
           <w:szCs w:val="24"/>
         </w:rPr>
-        <w:t>: ______________________________________________________________________</w:t>
+        <w:t>:</w:t>
       </w:r>
     </w:p>
     <w:p>
@@ -930,10 +847,172 @@
         </w:rPr>
       </w:pPr>
     </w:p>
+    <w:p>
+      <w:pPr>
+        <w:pBdr>
+          <w:top w:val="single" w:sz="12" w:space="1" w:color="auto"/>
+          <w:bottom w:val="single" w:sz="12" w:space="1" w:color="auto"/>
+        </w:pBdr>
+        <w:tabs>
+          <w:tab w:val="left" w:pos="0"/>
+        </w:tabs>
+        <w:spacing w:after="0"/>
+        <w:jc w:val="both"/>
+        <w:rPr>
+          <w:rFonts w:ascii="Times New Roman" w:eastAsia="Times New Roman" w:hAnsi="Times New Roman" w:cs="Times New Roman"/>
+          <w:sz w:val="24"/>
+          <w:szCs w:val="24"/>
+        </w:rPr>
+      </w:pPr>
+    </w:p>
+    <w:p>
+      <w:pPr>
+        <w:pBdr>
+          <w:bottom w:val="single" w:sz="12" w:space="1" w:color="auto"/>
+          <w:between w:val="single" w:sz="12" w:space="1" w:color="auto"/>
+        </w:pBdr>
+        <w:tabs>
+          <w:tab w:val="left" w:pos="0"/>
+        </w:tabs>
+        <w:spacing w:after="0"/>
+        <w:jc w:val="both"/>
+        <w:rPr>
+          <w:rFonts w:ascii="Times New Roman" w:eastAsia="Times New Roman" w:hAnsi="Times New Roman" w:cs="Times New Roman"/>
+          <w:sz w:val="24"/>
+          <w:szCs w:val="24"/>
+        </w:rPr>
+      </w:pPr>
+    </w:p>
+    <w:p>
+      <w:pPr>
+        <w:pBdr>
+          <w:bottom w:val="single" w:sz="12" w:space="1" w:color="auto"/>
+          <w:between w:val="single" w:sz="12" w:space="1" w:color="auto"/>
+        </w:pBdr>
+        <w:tabs>
+          <w:tab w:val="left" w:pos="0"/>
+        </w:tabs>
+        <w:spacing w:after="0"/>
+        <w:jc w:val="both"/>
+        <w:rPr>
+          <w:rFonts w:ascii="Times New Roman" w:eastAsia="Times New Roman" w:hAnsi="Times New Roman" w:cs="Times New Roman"/>
+          <w:sz w:val="24"/>
+          <w:szCs w:val="24"/>
+        </w:rPr>
+      </w:pPr>
+    </w:p>
+    <w:p>
+      <w:pPr>
+        <w:pBdr>
+          <w:bottom w:val="single" w:sz="12" w:space="1" w:color="auto"/>
+          <w:between w:val="single" w:sz="12" w:space="1" w:color="auto"/>
+        </w:pBdr>
+        <w:tabs>
+          <w:tab w:val="left" w:pos="0"/>
+        </w:tabs>
+        <w:spacing w:after="0"/>
+        <w:jc w:val="both"/>
+        <w:rPr>
+          <w:rFonts w:ascii="Times New Roman" w:eastAsia="Times New Roman" w:hAnsi="Times New Roman" w:cs="Times New Roman"/>
+          <w:sz w:val="24"/>
+          <w:szCs w:val="24"/>
+        </w:rPr>
+      </w:pPr>
+    </w:p>
+    <w:p>
+      <w:pPr>
+        <w:pBdr>
+          <w:bottom w:val="single" w:sz="12" w:space="1" w:color="auto"/>
+          <w:between w:val="single" w:sz="12" w:space="1" w:color="auto"/>
+        </w:pBdr>
+        <w:tabs>
+          <w:tab w:val="left" w:pos="0"/>
+        </w:tabs>
+        <w:spacing w:after="0"/>
+        <w:jc w:val="both"/>
+        <w:rPr>
+          <w:rFonts w:ascii="Times New Roman" w:eastAsia="Times New Roman" w:hAnsi="Times New Roman" w:cs="Times New Roman"/>
+          <w:sz w:val="24"/>
+          <w:szCs w:val="24"/>
+        </w:rPr>
+      </w:pPr>
+    </w:p>
+    <w:p>
+      <w:pPr>
+        <w:pBdr>
+          <w:bottom w:val="single" w:sz="12" w:space="1" w:color="auto"/>
+          <w:between w:val="single" w:sz="12" w:space="1" w:color="auto"/>
+        </w:pBdr>
+        <w:tabs>
+          <w:tab w:val="left" w:pos="0"/>
+        </w:tabs>
+        <w:spacing w:after="0"/>
+        <w:jc w:val="both"/>
+        <w:rPr>
+          <w:rFonts w:ascii="Times New Roman" w:eastAsia="Times New Roman" w:hAnsi="Times New Roman" w:cs="Times New Roman"/>
+          <w:sz w:val="24"/>
+          <w:szCs w:val="24"/>
+        </w:rPr>
+      </w:pPr>
+    </w:p>
+    <w:p>
+      <w:pPr>
+        <w:pBdr>
+          <w:bottom w:val="single" w:sz="12" w:space="1" w:color="auto"/>
+          <w:between w:val="single" w:sz="12" w:space="1" w:color="auto"/>
+        </w:pBdr>
+        <w:tabs>
+          <w:tab w:val="left" w:pos="0"/>
+        </w:tabs>
+        <w:spacing w:after="0"/>
+        <w:jc w:val="both"/>
+        <w:rPr>
+          <w:rFonts w:ascii="Times New Roman" w:eastAsia="Times New Roman" w:hAnsi="Times New Roman" w:cs="Times New Roman"/>
+          <w:sz w:val="24"/>
+          <w:szCs w:val="24"/>
+        </w:rPr>
+      </w:pPr>
+    </w:p>
+    <w:p>
+      <w:pPr>
+        <w:tabs>
+          <w:tab w:val="left" w:pos="0"/>
+        </w:tabs>
+        <w:spacing w:after="0"/>
+        <w:jc w:val="both"/>
+        <w:rPr>
+          <w:rFonts w:ascii="Times New Roman" w:eastAsia="Times New Roman" w:hAnsi="Times New Roman" w:cs="Times New Roman"/>
+          <w:sz w:val="24"/>
+          <w:szCs w:val="24"/>
+        </w:rPr>
+      </w:pPr>
+    </w:p>
+    <w:p>
+      <w:pPr>
+        <w:tabs>
+          <w:tab w:val="left" w:pos="0"/>
+        </w:tabs>
+        <w:spacing w:after="0"/>
+        <w:jc w:val="both"/>
+        <w:rPr>
+          <w:rFonts w:ascii="Times New Roman" w:eastAsia="Times New Roman" w:hAnsi="Times New Roman" w:cs="Times New Roman"/>
+          <w:sz w:val="24"/>
+          <w:szCs w:val="24"/>
+        </w:rPr>
+      </w:pPr>
+    </w:p>
     <w:tbl>
       <w:tblPr>
         <w:tblStyle w:val="TableGrid"/>
         <w:tblW w:w="0" w:type="auto"/>
+        <w:tblBorders>
+          <w:top w:val="none" w:sz="0" w:space="0" w:color="auto"/>
+          <w:left w:val="none" w:sz="0" w:space="0" w:color="auto"/>
+          <w:bottom w:val="none" w:sz="0" w:space="0" w:color="auto"/>
+          <w:right w:val="none" w:sz="0" w:space="0" w:color="auto"/>
+          <w:insideH w:val="none" w:sz="0" w:space="0" w:color="auto"/>
+          <w:insideV w:val="none" w:sz="0" w:space="0" w:color="auto"/>
+        </w:tblBorders>
         <w:tblLayout w:type="fixed"/>
         <w:tblLook w:val="04A0" w:firstRow="1" w:lastRow="0" w:firstColumn="1" w:lastColumn="0" w:noHBand="0" w:noVBand="1"/>
       </w:tblPr>
@@ -974,7 +1053,6 @@
                 <w:tab w:val="left" w:pos="0"/>
                 <w:tab w:val="left" w:pos="4536"/>
               </w:tabs>
-              <w:jc w:val="both"/>
               <w:rPr>
                 <w:rFonts w:ascii="Times New Roman" w:eastAsia="Times New Roman" w:hAnsi="Times New Roman" w:cs="Times New Roman"/>
                 <w:sz w:val="24"/>
@@ -997,7 +1075,6 @@
                 <w:tab w:val="left" w:pos="4536"/>
               </w:tabs>
               <w:ind w:firstLine="4536"/>
-              <w:jc w:val="both"/>
               <w:rPr>
                 <w:rFonts w:ascii="Times New Roman" w:eastAsia="Times New Roman" w:hAnsi="Times New Roman" w:cs="Times New Roman"/>
                 <w:sz w:val="24"/>
@@ -1012,7 +1089,6 @@
                 <w:tab w:val="left" w:pos="4536"/>
               </w:tabs>
               <w:ind w:firstLine="4536"/>
-              <w:jc w:val="both"/>
               <w:rPr>
                 <w:rFonts w:ascii="Times New Roman" w:eastAsia="Times New Roman" w:hAnsi="Times New Roman" w:cs="Times New Roman"/>
                 <w:sz w:val="24"/>
@@ -1027,7 +1103,6 @@
                 <w:tab w:val="left" w:pos="4536"/>
               </w:tabs>
               <w:ind w:firstLine="4536"/>
-              <w:jc w:val="both"/>
               <w:rPr>
                 <w:rFonts w:ascii="Times New Roman" w:eastAsia="Times New Roman" w:hAnsi="Times New Roman" w:cs="Times New Roman"/>
                 <w:sz w:val="24"/>
@@ -1042,7 +1117,6 @@
                 <w:tab w:val="left" w:pos="4536"/>
               </w:tabs>
               <w:ind w:firstLine="4536"/>
-              <w:jc w:val="both"/>
               <w:rPr>
                 <w:rFonts w:ascii="Times New Roman" w:eastAsia="Times New Roman" w:hAnsi="Times New Roman" w:cs="Times New Roman"/>
                 <w:sz w:val="24"/>
@@ -1056,7 +1130,6 @@
                 <w:tab w:val="left" w:pos="0"/>
                 <w:tab w:val="left" w:pos="4536"/>
               </w:tabs>
-              <w:jc w:val="both"/>
               <w:rPr>
                 <w:rFonts w:ascii="Times New Roman" w:eastAsia="Times New Roman" w:hAnsi="Times New Roman" w:cs="Times New Roman"/>
                 <w:sz w:val="24"/>
@@ -1078,7 +1151,6 @@
                 <w:tab w:val="left" w:pos="0"/>
                 <w:tab w:val="left" w:pos="3969"/>
               </w:tabs>
-              <w:jc w:val="both"/>
               <w:rPr>
                 <w:rFonts w:ascii="Times New Roman" w:eastAsia="Times New Roman" w:hAnsi="Times New Roman" w:cs="Times New Roman"/>
                 <w:sz w:val="24"/>
@@ -1122,7 +1194,6 @@
                 <w:tab w:val="left" w:pos="0"/>
                 <w:tab w:val="left" w:pos="4536"/>
               </w:tabs>
-              <w:jc w:val="both"/>
               <w:rPr>
                 <w:rFonts w:ascii="Times New Roman" w:eastAsia="Times New Roman" w:hAnsi="Times New Roman" w:cs="Times New Roman"/>
                 <w:sz w:val="24"/>
@@ -1161,25 +1232,23 @@
     </w:tbl>
     <w:p>
       <w:pPr>
-        <w:tabs>
-          <w:tab w:val="left" w:pos="0"/>
-          <w:tab w:val="left" w:pos="4536"/>
-        </w:tabs>
-        <w:spacing w:after="0"/>
+        <w:spacing w:line="276" w:lineRule="auto"/>
+        <w:ind w:left="142" w:right="1446"/>
         <w:jc w:val="both"/>
         <w:rPr>
-          <w:rFonts w:ascii="Times New Roman" w:eastAsia="Times New Roman" w:hAnsi="Times New Roman" w:cs="Times New Roman"/>
+          <w:rFonts w:ascii="Times New Roman" w:hAnsi="Times New Roman" w:cs="Times New Roman"/>
           <w:sz w:val="24"/>
           <w:szCs w:val="24"/>
         </w:rPr>
       </w:pPr>
     </w:p>
     <w:sectPr>
-      <w:headerReference w:type="default" r:id="rId7"/>
-      <w:pgSz w:w="11906" w:h="16838"/>
-      <w:pgMar w:top="915" w:right="1440" w:bottom="1440" w:left="1440" w:header="270" w:footer="900" w:gutter="0"/>
-      <w:pgNumType w:start="1"/>
+      <w:headerReference w:type="default" r:id="rId8"/>
+      <w:footerReference w:type="default" r:id="rId9"/>
+      <w:pgSz w:w="11906" w:h="16838" w:code="9"/>
+      <w:pgMar w:top="1440" w:right="1440" w:bottom="1440" w:left="1440" w:header="270" w:footer="900" w:gutter="0"/>
       <w:cols w:space="720"/>
+      <w:docGrid w:linePitch="360"/>
     </w:sectPr>
   </w:body>
 </w:document>
@@ -1210,6 +1279,169 @@
 </w:endnotes>
 </file>
 
+<file path=word/footer1.xml><?xml version="1.0" encoding="utf-8"?>
+<w:ftr xmlns:wpc="http://schemas.microsoft.com/office/word/2010/wordprocessingCanvas" xmlns:cx="http://schemas.microsoft.com/office/drawing/2014/chartex" xmlns:cx1="http://schemas.microsoft.com/office/drawing/2015/9/8/chartex" xmlns:cx2="http://schemas.microsoft.com/office/drawing/2015/10/21/chartex" xmlns:cx3="http://schemas.microsoft.com/office/drawing/2016/5/9/chartex" xmlns:cx4="http://schemas.microsoft.com/office/drawing/2016/5/10/chartex" xmlns:cx5="http://schemas.microsoft.com/office/drawing/2016/5/11/chartex" xmlns:cx6="http://schemas.microsoft.com/office/drawing/2016/5/12/chartex" xmlns:cx7="http://schemas.microsoft.com/office/drawing/2016/5/13/chartex" xmlns:cx8="http://schemas.microsoft.com/office/drawing/2016/5/14/chartex" xmlns:mc="http://schemas.openxmlformats.org/markup-compatibility/2006" xmlns:aink="http://schemas.microsoft.com/office/drawing/2016/ink" xmlns:am3d="http://schemas.microsoft.com/office/drawing/2017/model3d" xmlns:o="urn:schemas-microsoft-com:office:office" xmlns:oel="http://schemas.microsoft.com/office/2019/extlst" xmlns:r="http://schemas.openxmlformats.org/officeDocument/2006/relationships" xmlns:m="http://schemas.openxmlformats.org/officeDocument/2006/math" xmlns:v="urn:schemas-microsoft-com:vml" xmlns:wp14="http://schemas.microsoft.com/office/word/2010/wordprocessingDrawing" xmlns:wp="http://schemas.openxmlformats.org/drawingml/2006/wordprocessingDrawing" xmlns:w10="urn:schemas-microsoft-com:office:word" xmlns:w="http://schemas.openxmlformats.org/wordprocessingml/2006/main" xmlns:w14="http://schemas.microsoft.com/office/word/2010/wordml" xmlns:w15="http://schemas.microsoft.com/office/word/2012/wordml" xmlns:w16cex="http://schemas.microsoft.com/office/word/2018/wordml/cex" xmlns:w16cid="http://schemas.microsoft.com/office/word/2016/wordml/cid" xmlns:w16="http://schemas.microsoft.com/office/word/2018/wordml" xmlns:w16du="http://schemas.microsoft.com/office/word/2023/wordml/word16du" xmlns:w16sdtdh="http://schemas.microsoft.com/office/word/2020/wordml/sdtdatahash" xmlns:w16sdtfl="http://schemas.microsoft.com/office/word/2024/wordml/sdtformatlock" xmlns:w16se="http://schemas.microsoft.com/office/word/2015/wordml/symex" xmlns:wpg="http://schemas.microsoft.com/office/word/2010/wordprocessingGroup" xmlns:wpi="http://schemas.microsoft.com/office/word/2010/wordprocessingInk" xmlns:wne="http://schemas.microsoft.com/office/word/2006/wordml" xmlns:wps="http://schemas.microsoft.com/office/word/2010/wordprocessingShape" mc:Ignorable="w14 w15 w16se w16cid w16 w16cex w16sdtdh w16sdtfl w16du wp14">
+  <w:bookmarkStart w:id="2" w:name="_Hlk32345472"/>
+  <w:bookmarkStart w:id="3" w:name="_Hlk32345473"/>
+  <w:p>
+    <w:pPr>
+      <w:pStyle w:val="Footer"/>
+      <w:ind w:hanging="540"/>
+      <w:jc w:val="both"/>
+      <w:rPr>
+        <w:rFonts w:ascii="Times New Roman" w:hAnsi="Times New Roman" w:cs="Times New Roman"/>
+        <w:sz w:val="18"/>
+        <w:szCs w:val="18"/>
+      </w:rPr>
+    </w:pPr>
+    <w:r>
+      <w:rPr>
+        <w:rFonts w:ascii="Times New Roman" w:hAnsi="Times New Roman" w:cs="Times New Roman"/>
+        <w:noProof/>
+        <w:sz w:val="18"/>
+        <w:szCs w:val="18"/>
+      </w:rPr>
+      <mc:AlternateContent>
+        <mc:Choice Requires="wps">
+          <w:drawing>
+            <wp:anchor distT="0" distB="0" distL="114300" distR="114300" simplePos="0" relativeHeight="251667456" behindDoc="0" locked="0" layoutInCell="1" allowOverlap="1" wp14:anchorId="6B4D8247" wp14:editId="38671BC8">
+              <wp:simplePos x="0" y="0"/>
+              <wp:positionH relativeFrom="column">
+                <wp:posOffset>-676275</wp:posOffset>
+              </wp:positionH>
+              <wp:positionV relativeFrom="paragraph">
+                <wp:posOffset>-73660</wp:posOffset>
+              </wp:positionV>
+              <wp:extent cx="7086600" cy="0"/>
+              <wp:effectExtent l="9525" t="12065" r="9525" b="6985"/>
+              <wp:wrapNone/>
+              <wp:docPr id="1577293841" name="AutoShape 11"/>
+              <wp:cNvGraphicFramePr>
+                <a:graphicFrameLocks xmlns:a="http://schemas.openxmlformats.org/drawingml/2006/main"/>
+              </wp:cNvGraphicFramePr>
+              <a:graphic xmlns:a="http://schemas.openxmlformats.org/drawingml/2006/main">
+                <a:graphicData uri="http://schemas.microsoft.com/office/word/2010/wordprocessingShape">
+                  <wps:wsp>
+                    <wps:cNvCnPr>
+                      <a:cxnSpLocks noChangeShapeType="1"/>
+                    </wps:cNvCnPr>
+                    <wps:spPr bwMode="auto">
+                      <a:xfrm>
+                        <a:off x="0" y="0"/>
+                        <a:ext cx="7086600" cy="0"/>
+                      </a:xfrm>
+                      <a:prstGeom prst="straightConnector1">
+                        <a:avLst/>
+                      </a:prstGeom>
+                      <a:noFill/>
+                      <a:ln w="3175">
+                        <a:solidFill>
+                          <a:srgbClr val="000000"/>
+                        </a:solidFill>
+                        <a:round/>
+                        <a:headEnd/>
+                        <a:tailEnd/>
+                      </a:ln>
+                      <a:extLst>
+                        <a:ext uri="{909E8E84-426E-40DD-AFC4-6F175D3DCCD1}">
+                          <a14:hiddenFill xmlns:a14="http://schemas.microsoft.com/office/drawing/2010/main">
+                            <a:noFill/>
+                          </a14:hiddenFill>
+                        </a:ext>
+                      </a:extLst>
+                    </wps:spPr>
+                    <wps:bodyPr/>
+                  </wps:wsp>
+                </a:graphicData>
+              </a:graphic>
+              <wp14:sizeRelH relativeFrom="page">
+                <wp14:pctWidth>0</wp14:pctWidth>
+              </wp14:sizeRelH>
+              <wp14:sizeRelV relativeFrom="page">
+                <wp14:pctHeight>0</wp14:pctHeight>
+              </wp14:sizeRelV>
+            </wp:anchor>
+          </w:drawing>
+        </mc:Choice>
+        <mc:Fallback xmlns:w16cei="http://schemas.microsoft.com/office/word/2026/wordml/cei">
+          <w:pict>
+            <v:shapetype w14:anchorId="0D96438A" id="_x0000_t32" coordsize="21600,21600" o:spt="32" o:oned="t" path="m,l21600,21600e" filled="f">
+              <v:path arrowok="t" fillok="f" o:connecttype="none"/>
+              <o:lock v:ext="edit" shapetype="t"/>
+            </v:shapetype>
+            <v:shape id="AutoShape 11" o:spid="_x0000_s1026" type="#_x0000_t32" style="position:absolute;margin-left:-53.25pt;margin-top:-5.8pt;width:558pt;height:0;z-index:251667456;visibility:visible;mso-wrap-style:square;mso-width-percent:0;mso-height-percent:0;mso-wrap-distance-left:9pt;mso-wrap-distance-top:0;mso-wrap-distance-right:9pt;mso-wrap-distance-bottom:0;mso-position-horizontal:absolute;mso-position-horizontal-relative:text;mso-position-vertical:absolute;mso-position-vertical-relative:text;mso-width-percent:0;mso-height-percent:0;mso-width-relative:page;mso-height-relative:page" o:gfxdata="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" strokeweight=".25pt"/>
+          </w:pict>
+        </mc:Fallback>
+      </mc:AlternateContent>
+    </w:r>
+    <w:proofErr w:type="spellStart"/>
+    <w:r>
+      <w:rPr>
+        <w:rFonts w:ascii="Times New Roman" w:hAnsi="Times New Roman" w:cs="Times New Roman"/>
+        <w:sz w:val="18"/>
+        <w:szCs w:val="18"/>
+      </w:rPr>
+      <w:t>Dicetak</w:t>
+    </w:r>
+    <w:proofErr w:type="spellEnd"/>
+    <w:r>
+      <w:rPr>
+        <w:rFonts w:ascii="Times New Roman" w:hAnsi="Times New Roman" w:cs="Times New Roman"/>
+        <w:sz w:val="18"/>
+        <w:szCs w:val="18"/>
+      </w:rPr>
+      <w:t xml:space="preserve"> </w:t>
+    </w:r>
+    <w:proofErr w:type="spellStart"/>
+    <w:r>
+      <w:rPr>
+        <w:rFonts w:ascii="Times New Roman" w:hAnsi="Times New Roman" w:cs="Times New Roman"/>
+        <w:sz w:val="18"/>
+        <w:szCs w:val="18"/>
+      </w:rPr>
+      <w:t>tgl</w:t>
+    </w:r>
+    <w:proofErr w:type="spellEnd"/>
+    <w:r>
+      <w:rPr>
+        <w:rFonts w:ascii="Times New Roman" w:hAnsi="Times New Roman" w:cs="Times New Roman"/>
+        <w:sz w:val="18"/>
+        <w:szCs w:val="18"/>
+      </w:rPr>
+      <w:t>:</w:t>
+    </w:r>
+    <w:bookmarkEnd w:id="2"/>
+    <w:bookmarkEnd w:id="3"/>
+    <w:r>
+      <w:rPr>
+        <w:rFonts w:ascii="Times New Roman" w:hAnsi="Times New Roman" w:cs="Times New Roman"/>
+        <w:sz w:val="18"/>
+        <w:szCs w:val="18"/>
+      </w:rPr>
+      <w:t xml:space="preserve"> {</w:t>
+    </w:r>
+    <w:proofErr w:type="spellStart"/>
+    <w:r>
+      <w:rPr>
+        <w:rFonts w:ascii="Times New Roman" w:hAnsi="Times New Roman" w:cs="Times New Roman"/>
+        <w:sz w:val="18"/>
+        <w:szCs w:val="18"/>
+      </w:rPr>
+      <w:t>tgl_cetak</w:t>
+    </w:r>
+    <w:proofErr w:type="spellEnd"/>
+    <w:r>
+      <w:rPr>
+        <w:rFonts w:ascii="Times New Roman" w:hAnsi="Times New Roman" w:cs="Times New Roman"/>
+        <w:sz w:val="18"/>
+        <w:szCs w:val="18"/>
+      </w:rPr>
+      <w:t>}</w:t>
+    </w:r>
+  </w:p>
+</w:ftr>
+</file>
+
 <file path=word/footnotes.xml><?xml version="1.0" encoding="utf-8"?>
 <w:footnotes xmlns:wpc="http://schemas.microsoft.com/office/word/2010/wordprocessingCanvas" xmlns:cx="http://schemas.microsoft.com/office/drawing/2014/chartex" xmlns:cx1="http://schemas.microsoft.com/office/drawing/2015/9/8/chartex" xmlns:cx2="http://schemas.microsoft.com/office/drawing/2015/10/21/chartex" xmlns:cx3="http://schemas.microsoft.com/office/drawing/2016/5/9/chartex" xmlns:cx4="http://schemas.microsoft.com/office/drawing/2016/5/10/chartex" xmlns:cx5="http://schemas.microsoft.com/office/drawing/2016/5/11/chartex" xmlns:cx6="http://schemas.microsoft.com/office/drawing/2016/5/12/chartex" xmlns:cx7="http://schemas.microsoft.com/office/drawing/2016/5/13/chartex" xmlns:cx8="http://schemas.microsoft.com/office/drawing/2016/5/14/chartex" xmlns:mc="http://schemas.openxmlformats.org/markup-compatibility/2006" xmlns:aink="http://schemas.microsoft.com/office/drawing/2016/ink" xmlns:am3d="http://schemas.microsoft.com/office/drawing/2017/model3d" xmlns:o="urn:schemas-microsoft-com:office:office" xmlns:oel="http://schemas.microsoft.com/office/2019/extlst" xmlns:r="http://schemas.openxmlformats.org/officeDocument/2006/relationships" xmlns:m="http://schemas.openxmlformats.org/officeDocument/2006/math" xmlns:v="urn:schemas-microsoft-com:vml" xmlns:wp14="http://schemas.microsoft.com/office/word/2010/wordprocessingDrawing" xmlns:wp="http://schemas.openxmlformats.org/drawingml/2006/wordprocessingDrawing" xmlns:w10="urn:schemas-microsoft-com:office:word" xmlns:w="http://schemas.openxmlformats.org/wordprocessingml/2006/main" xmlns:w14="http://schemas.microsoft.com/office/word/2010/wordml" xmlns:w15="http://schemas.microsoft.com/office/word/2012/wordml" xmlns:w16cex="http://schemas.microsoft.com/office/word/2018/wordml/cex" xmlns:w16cid="http://schemas.microsoft.com/office/word/2016/wordml/cid" xmlns:w16="http://schemas.microsoft.com/office/word/2018/wordml" xmlns:w16du="http://schemas.microsoft.com/office/word/2023/wordml/word16du" xmlns:w16sdtdh="http://schemas.microsoft.com/office/word/2020/wordml/sdtdatahash" xmlns:w16sdtfl="http://schemas.microsoft.com/office/word/2024/wordml/sdtformatlock" xmlns:w16se="http://schemas.microsoft.com/office/word/2015/wordml/symex" xmlns:wpg="http://schemas.microsoft.com/office/word/2010/wordprocessingGroup" xmlns:wpi="http://schemas.microsoft.com/office/word/2010/wordprocessingInk" xmlns:wne="http://schemas.microsoft.com/office/word/2006/wordml" xmlns:wps="http://schemas.microsoft.com/office/word/2010/wordprocessingShape" mc:Ignorable="w14 w15 w16se w16cid w16 w16cex w16sdtdh w16sdtfl w16du wp14">
   <w:footnote w:type="separator" w:id="-1">
@@ -1237,599 +1469,497 @@
 
 <file path=word/header1.xml><?xml version="1.0" encoding="utf-8"?>
 <w:hdr xmlns:wpc="http://schemas.microsoft.com/office/word/2010/wordprocessingCanvas" xmlns:cx="http://schemas.microsoft.com/office/drawing/2014/chartex" xmlns:cx1="http://schemas.microsoft.com/office/drawing/2015/9/8/chartex" xmlns:cx2="http://schemas.microsoft.com/office/drawing/2015/10/21/chartex" xmlns:cx3="http://schemas.microsoft.com/office/drawing/2016/5/9/chartex" xmlns:cx4="http://schemas.microsoft.com/office/drawing/2016/5/10/chartex" xmlns:cx5="http://schemas.microsoft.com/office/drawing/2016/5/11/chartex" xmlns:cx6="http://schemas.microsoft.com/office/drawing/2016/5/12/chartex" xmlns:cx7="http://schemas.microsoft.com/office/drawing/2016/5/13/chartex" xmlns:cx8="http://schemas.microsoft.com/office/drawing/2016/5/14/chartex" xmlns:mc="http://schemas.openxmlformats.org/markup-compatibility/2006" xmlns:aink="http://schemas.microsoft.com/office/drawing/2016/ink" xmlns:am3d="http://schemas.microsoft.com/office/drawing/2017/model3d" xmlns:o="urn:schemas-microsoft-com:office:office" xmlns:oel="http://schemas.microsoft.com/office/2019/extlst" xmlns:r="http://schemas.openxmlformats.org/officeDocument/2006/relationships" xmlns:m="http://schemas.openxmlformats.org/officeDocument/2006/math" xmlns:v="urn:schemas-microsoft-com:vml" xmlns:wp14="http://schemas.microsoft.com/office/word/2010/wordprocessingDrawing" xmlns:wp="http://schemas.openxmlformats.org/drawingml/2006/wordprocessingDrawing" xmlns:w10="urn:schemas-microsoft-com:office:word" xmlns:w="http://schemas.openxmlformats.org/wordprocessingml/2006/main" xmlns:w14="http://schemas.microsoft.com/office/word/2010/wordml" xmlns:w15="http://schemas.microsoft.com/office/word/2012/wordml" xmlns:w16cex="http://schemas.microsoft.com/office/word/2018/wordml/cex" xmlns:w16cid="http://schemas.microsoft.com/office/word/2016/wordml/cid" xmlns:w16="http://schemas.microsoft.com/office/word/2018/wordml" xmlns:w16du="http://schemas.microsoft.com/office/word/2023/wordml/word16du" xmlns:w16sdtdh="http://schemas.microsoft.com/office/word/2020/wordml/sdtdatahash" xmlns:w16sdtfl="http://schemas.microsoft.com/office/word/2024/wordml/sdtformatlock" xmlns:w16se="http://schemas.microsoft.com/office/word/2015/wordml/symex" xmlns:wpg="http://schemas.microsoft.com/office/word/2010/wordprocessingGroup" xmlns:wpi="http://schemas.microsoft.com/office/word/2010/wordprocessingInk" xmlns:wne="http://schemas.microsoft.com/office/word/2006/wordml" xmlns:wps="http://schemas.microsoft.com/office/word/2010/wordprocessingShape" mc:Ignorable="w14 w15 w16se w16cid w16 w16cex w16sdtdh w16sdtfl w16du wp14">
+  <w:tbl>
+    <w:tblPr>
+      <w:tblStyle w:val="TableGrid1"/>
+      <w:tblW w:w="11314" w:type="dxa"/>
+      <w:tblInd w:w="-1134" w:type="dxa"/>
+      <w:tblBorders>
+        <w:top w:val="none" w:sz="0" w:space="0" w:color="auto"/>
+        <w:left w:val="none" w:sz="0" w:space="0" w:color="auto"/>
+        <w:bottom w:val="none" w:sz="0" w:space="0" w:color="auto"/>
+        <w:right w:val="none" w:sz="0" w:space="0" w:color="auto"/>
+        <w:insideH w:val="none" w:sz="0" w:space="0" w:color="auto"/>
+        <w:insideV w:val="none" w:sz="0" w:space="0" w:color="auto"/>
+      </w:tblBorders>
+      <w:tblLook w:val="04A0" w:firstRow="1" w:lastRow="0" w:firstColumn="1" w:lastColumn="0" w:noHBand="0" w:noVBand="1"/>
+    </w:tblPr>
+    <w:tblGrid>
+      <w:gridCol w:w="1611"/>
+      <w:gridCol w:w="5907"/>
+      <w:gridCol w:w="3796"/>
+    </w:tblGrid>
+    <w:tr>
+      <w:tc>
+        <w:tcPr>
+          <w:tcW w:w="1611" w:type="dxa"/>
+          <w:hideMark/>
+        </w:tcPr>
+        <w:p>
+          <w:pPr>
+            <w:tabs>
+              <w:tab w:val="center" w:pos="4680"/>
+              <w:tab w:val="right" w:pos="9360"/>
+            </w:tabs>
+            <w:spacing w:before="240" w:after="240"/>
+            <w:jc w:val="center"/>
+          </w:pPr>
+          <w:bookmarkStart w:id="0" w:name="_Hlk184387129"/>
+          <w:bookmarkStart w:id="1" w:name="_Hlk184387130"/>
+          <w:r>
+            <w:rPr>
+              <w:noProof/>
+            </w:rPr>
+            <w:drawing>
+              <wp:inline distT="0" distB="0" distL="0" distR="0" wp14:anchorId="1D82902A" wp14:editId="34E1533B">
+                <wp:extent cx="876300" cy="986155"/>
+                <wp:effectExtent l="0" t="0" r="0" b="4445"/>
+                <wp:docPr id="5" name="Picture 1"/>
+                <wp:cNvGraphicFramePr>
+                  <a:graphicFrameLocks xmlns:a="http://schemas.openxmlformats.org/drawingml/2006/main" noChangeAspect="1"/>
+                </wp:cNvGraphicFramePr>
+                <a:graphic xmlns:a="http://schemas.openxmlformats.org/drawingml/2006/main">
+                  <a:graphicData uri="http://schemas.openxmlformats.org/drawingml/2006/picture">
+                    <pic:pic xmlns:pic="http://schemas.openxmlformats.org/drawingml/2006/picture">
+                      <pic:nvPicPr>
+                        <pic:cNvPr id="0" name="Picture 1"/>
+                        <pic:cNvPicPr>
+                          <a:picLocks noChangeAspect="1" noChangeArrowheads="1"/>
+                        </pic:cNvPicPr>
+                      </pic:nvPicPr>
+                      <pic:blipFill>
+                        <a:blip r:embed="rId1">
+                          <a:extLst>
+                            <a:ext uri="{28A0092B-C50C-407E-A947-70E740481C1C}">
+                              <a14:useLocalDpi xmlns:a14="http://schemas.microsoft.com/office/drawing/2010/main" val="0"/>
+                            </a:ext>
+                          </a:extLst>
+                        </a:blip>
+                        <a:srcRect l="41176" t="41138" r="41830" b="25377"/>
+                        <a:stretch>
+                          <a:fillRect/>
+                        </a:stretch>
+                      </pic:blipFill>
+                      <pic:spPr bwMode="auto">
+                        <a:xfrm>
+                          <a:off x="0" y="0"/>
+                          <a:ext cx="876300" cy="986155"/>
+                        </a:xfrm>
+                        <a:prstGeom prst="rect">
+                          <a:avLst/>
+                        </a:prstGeom>
+                        <a:noFill/>
+                        <a:ln>
+                          <a:noFill/>
+                        </a:ln>
+                      </pic:spPr>
+                    </pic:pic>
+                  </a:graphicData>
+                </a:graphic>
+              </wp:inline>
+            </w:drawing>
+          </w:r>
+        </w:p>
+      </w:tc>
+      <w:tc>
+        <w:tcPr>
+          <w:tcW w:w="5907" w:type="dxa"/>
+        </w:tcPr>
+        <w:p>
+          <w:pPr>
+            <w:rPr>
+              <w:rFonts w:ascii="Times New Roman" w:hAnsi="Times New Roman"/>
+              <w:b/>
+              <w:color w:val="0070C0"/>
+            </w:rPr>
+          </w:pPr>
+        </w:p>
+        <w:p>
+          <w:pPr>
+            <w:rPr>
+              <w:rFonts w:ascii="Times New Roman" w:hAnsi="Times New Roman"/>
+              <w:b/>
+              <w:color w:val="0070C0"/>
+            </w:rPr>
+          </w:pPr>
+          <w:r>
+            <w:rPr>
+              <w:rFonts w:ascii="Times New Roman" w:hAnsi="Times New Roman"/>
+              <w:b/>
+              <w:color w:val="0070C0"/>
+            </w:rPr>
+            <w:t>KEMENTERIAN PENDIDIKAN TINGGI, SAINS,</w:t>
+          </w:r>
+        </w:p>
+        <w:p>
+          <w:pPr>
+            <w:rPr>
+              <w:rFonts w:ascii="Times New Roman" w:hAnsi="Times New Roman"/>
+              <w:b/>
+              <w:color w:val="0070C0"/>
+            </w:rPr>
+          </w:pPr>
+          <w:r>
+            <w:rPr>
+              <w:rFonts w:ascii="Times New Roman" w:hAnsi="Times New Roman"/>
+              <w:b/>
+              <w:color w:val="0070C0"/>
+            </w:rPr>
+            <w:t>DAN TEKNOLOGI</w:t>
+          </w:r>
+        </w:p>
+        <w:p>
+          <w:pPr>
+            <w:rPr>
+              <w:rFonts w:ascii="Times New Roman" w:hAnsi="Times New Roman"/>
+              <w:b/>
+              <w:color w:val="0070C0"/>
+              <w:sz w:val="24"/>
+              <w:szCs w:val="24"/>
+            </w:rPr>
+          </w:pPr>
+          <w:r>
+            <w:rPr>
+              <w:rFonts w:ascii="Times New Roman" w:hAnsi="Times New Roman"/>
+              <w:b/>
+              <w:color w:val="0070C0"/>
+              <w:sz w:val="24"/>
+              <w:szCs w:val="24"/>
+            </w:rPr>
+            <w:t>UNIVERSITAS DIPONEGORO</w:t>
+          </w:r>
+        </w:p>
+        <w:p>
+          <w:pPr>
+            <w:rPr>
+              <w:rFonts w:ascii="Times New Roman" w:hAnsi="Times New Roman"/>
+              <w:b/>
+              <w:color w:val="0070C0"/>
+              <w:sz w:val="24"/>
+              <w:szCs w:val="24"/>
+            </w:rPr>
+          </w:pPr>
+          <w:r>
+            <w:rPr>
+              <w:rFonts w:ascii="Times New Roman" w:hAnsi="Times New Roman"/>
+              <w:b/>
+              <w:color w:val="0070C0"/>
+              <w:sz w:val="24"/>
+              <w:szCs w:val="24"/>
+            </w:rPr>
+            <w:t>FAKULTAS TEKNIK</w:t>
+          </w:r>
+        </w:p>
+        <w:p>
+          <w:pPr>
+            <w:rPr>
+              <w:rFonts w:ascii="Times New Roman" w:hAnsi="Times New Roman"/>
+              <w:b/>
+              <w:color w:val="0070C0"/>
+              <w:sz w:val="30"/>
+              <w:szCs w:val="30"/>
+            </w:rPr>
+          </w:pPr>
+          <w:r>
+            <w:rPr>
+              <w:rFonts w:ascii="Times New Roman" w:hAnsi="Times New Roman"/>
+              <w:b/>
+              <w:color w:val="0070C0"/>
+              <w:sz w:val="30"/>
+              <w:szCs w:val="30"/>
+            </w:rPr>
+            <w:t>DEPARTEMEN TEKNIK LINGKUNGAN</w:t>
+          </w:r>
+        </w:p>
+      </w:tc>
+      <w:tc>
+        <w:tcPr>
+          <w:tcW w:w="3796" w:type="dxa"/>
+        </w:tcPr>
+        <w:p>
+          <w:pPr>
+            <w:jc w:val="right"/>
+            <w:rPr>
+              <w:rFonts w:ascii="Times New Roman" w:hAnsi="Times New Roman"/>
+              <w:color w:val="0070C0"/>
+              <w:sz w:val="18"/>
+              <w:szCs w:val="18"/>
+            </w:rPr>
+          </w:pPr>
+        </w:p>
+        <w:p>
+          <w:pPr>
+            <w:jc w:val="right"/>
+            <w:rPr>
+              <w:rFonts w:ascii="Times New Roman" w:hAnsi="Times New Roman"/>
+              <w:color w:val="0070C0"/>
+              <w:sz w:val="18"/>
+              <w:szCs w:val="18"/>
+            </w:rPr>
+          </w:pPr>
+        </w:p>
+        <w:p>
+          <w:pPr>
+            <w:jc w:val="right"/>
+            <w:rPr>
+              <w:rFonts w:ascii="Times New Roman" w:hAnsi="Times New Roman"/>
+              <w:color w:val="0070C0"/>
+              <w:sz w:val="18"/>
+              <w:szCs w:val="18"/>
+            </w:rPr>
+          </w:pPr>
+        </w:p>
+        <w:p>
+          <w:pPr>
+            <w:jc w:val="right"/>
+            <w:rPr>
+              <w:rFonts w:ascii="Times New Roman" w:hAnsi="Times New Roman"/>
+              <w:color w:val="0070C0"/>
+              <w:sz w:val="18"/>
+              <w:szCs w:val="18"/>
+            </w:rPr>
+          </w:pPr>
+          <w:r>
+            <w:rPr>
+              <w:rFonts w:ascii="Times New Roman" w:hAnsi="Times New Roman"/>
+              <w:color w:val="0070C0"/>
+              <w:sz w:val="18"/>
+              <w:szCs w:val="18"/>
+            </w:rPr>
+            <w:t xml:space="preserve">Jalan Prof. </w:t>
+          </w:r>
+          <w:proofErr w:type="spellStart"/>
+          <w:r>
+            <w:rPr>
+              <w:rFonts w:ascii="Times New Roman" w:hAnsi="Times New Roman"/>
+              <w:color w:val="0070C0"/>
+              <w:sz w:val="18"/>
+              <w:szCs w:val="18"/>
+            </w:rPr>
+            <w:t>Sudarto</w:t>
+          </w:r>
+          <w:proofErr w:type="spellEnd"/>
+          <w:r>
+            <w:rPr>
+              <w:rFonts w:ascii="Times New Roman" w:hAnsi="Times New Roman"/>
+              <w:color w:val="0070C0"/>
+              <w:sz w:val="18"/>
+              <w:szCs w:val="18"/>
+            </w:rPr>
+            <w:t>, S.H.</w:t>
+          </w:r>
+        </w:p>
+        <w:p>
+          <w:pPr>
+            <w:jc w:val="right"/>
+            <w:rPr>
+              <w:rFonts w:ascii="Times New Roman" w:hAnsi="Times New Roman"/>
+              <w:color w:val="0070C0"/>
+              <w:sz w:val="18"/>
+              <w:szCs w:val="18"/>
+            </w:rPr>
+          </w:pPr>
+          <w:proofErr w:type="spellStart"/>
+          <w:r>
+            <w:rPr>
+              <w:rFonts w:ascii="Times New Roman" w:hAnsi="Times New Roman"/>
+              <w:color w:val="0070C0"/>
+              <w:sz w:val="18"/>
+              <w:szCs w:val="18"/>
+            </w:rPr>
+            <w:t>Tembalang</w:t>
+          </w:r>
+          <w:proofErr w:type="spellEnd"/>
+          <w:r>
+            <w:rPr>
+              <w:rFonts w:ascii="Times New Roman" w:hAnsi="Times New Roman"/>
+              <w:color w:val="0070C0"/>
+              <w:sz w:val="18"/>
+              <w:szCs w:val="18"/>
+            </w:rPr>
+            <w:t xml:space="preserve"> Semarang Kode Pos 50275</w:t>
+          </w:r>
+        </w:p>
+        <w:p>
+          <w:pPr>
+            <w:jc w:val="right"/>
+            <w:rPr>
+              <w:rFonts w:ascii="Times New Roman" w:hAnsi="Times New Roman"/>
+              <w:color w:val="0070C0"/>
+              <w:sz w:val="18"/>
+              <w:szCs w:val="18"/>
+            </w:rPr>
+          </w:pPr>
+          <w:r>
+            <w:rPr>
+              <w:rFonts w:ascii="Times New Roman" w:hAnsi="Times New Roman"/>
+              <w:color w:val="0070C0"/>
+              <w:sz w:val="18"/>
+              <w:szCs w:val="18"/>
+            </w:rPr>
+            <w:t xml:space="preserve">Tel. (024) 76480678, </w:t>
+          </w:r>
+          <w:proofErr w:type="spellStart"/>
+          <w:r>
+            <w:rPr>
+              <w:rFonts w:ascii="Times New Roman" w:hAnsi="Times New Roman"/>
+              <w:color w:val="0070C0"/>
+              <w:sz w:val="18"/>
+              <w:szCs w:val="18"/>
+            </w:rPr>
+            <w:t>Faks</w:t>
+          </w:r>
+          <w:proofErr w:type="spellEnd"/>
+          <w:r>
+            <w:rPr>
+              <w:rFonts w:ascii="Times New Roman" w:hAnsi="Times New Roman"/>
+              <w:color w:val="0070C0"/>
+              <w:sz w:val="18"/>
+              <w:szCs w:val="18"/>
+            </w:rPr>
+            <w:t>. (024) 7460053</w:t>
+          </w:r>
+        </w:p>
+        <w:p>
+          <w:pPr>
+            <w:jc w:val="right"/>
+            <w:rPr>
+              <w:rFonts w:ascii="Times New Roman" w:hAnsi="Times New Roman"/>
+              <w:color w:val="0070C0"/>
+              <w:sz w:val="18"/>
+              <w:szCs w:val="18"/>
+            </w:rPr>
+          </w:pPr>
+          <w:hyperlink r:id="rId2" w:history="1">
+            <w:r>
+              <w:rPr>
+                <w:rFonts w:ascii="Times New Roman" w:hAnsi="Times New Roman"/>
+                <w:color w:val="0070C0"/>
+                <w:sz w:val="18"/>
+                <w:szCs w:val="18"/>
+                <w:u w:val="single"/>
+              </w:rPr>
+              <w:t>www.ft.undip.ac.id</w:t>
+            </w:r>
+          </w:hyperlink>
+          <w:r>
+            <w:rPr>
+              <w:rFonts w:ascii="Times New Roman" w:hAnsi="Times New Roman"/>
+              <w:color w:val="0070C0"/>
+              <w:sz w:val="18"/>
+              <w:szCs w:val="18"/>
+            </w:rPr>
+            <w:t xml:space="preserve"> | email: enveng@live.undip.ac.id</w:t>
+          </w:r>
+        </w:p>
+      </w:tc>
+    </w:tr>
+    <w:bookmarkEnd w:id="0"/>
+    <w:bookmarkEnd w:id="1"/>
+  </w:tbl>
   <w:p>
     <w:pPr>
-      <w:pBdr>
-        <w:top w:val="nil"/>
-        <w:left w:val="nil"/>
-        <w:bottom w:val="nil"/>
-        <w:right w:val="nil"/>
-        <w:between w:val="nil"/>
-      </w:pBdr>
-      <w:tabs>
-        <w:tab w:val="center" w:pos="4680"/>
-        <w:tab w:val="right" w:pos="9360"/>
-      </w:tabs>
-      <w:spacing w:after="0" w:line="240" w:lineRule="auto"/>
-      <w:ind w:left="-993"/>
-      <w:rPr>
-        <w:color w:val="000000"/>
-      </w:rPr>
-    </w:pPr>
-    <w:r>
-      <w:rPr>
-        <w:noProof/>
-      </w:rPr>
-      <mc:AlternateContent>
-        <mc:Choice Requires="wps">
-          <w:drawing>
-            <wp:anchor distT="0" distB="0" distL="114300" distR="114300" simplePos="0" relativeHeight="251658240" behindDoc="0" locked="0" layoutInCell="1" hidden="0" allowOverlap="1" wp14:anchorId="18FC7E71" wp14:editId="430F4C7E">
-              <wp:simplePos x="0" y="0"/>
-              <wp:positionH relativeFrom="column">
-                <wp:posOffset>3812289</wp:posOffset>
-              </wp:positionH>
-              <wp:positionV relativeFrom="paragraph">
-                <wp:posOffset>443865</wp:posOffset>
-              </wp:positionV>
-              <wp:extent cx="2428875" cy="571500"/>
-              <wp:effectExtent l="0" t="0" r="0" b="0"/>
-              <wp:wrapNone/>
-              <wp:docPr id="9" name="Rectangle 9"/>
-              <wp:cNvGraphicFramePr/>
-              <a:graphic xmlns:a="http://schemas.openxmlformats.org/drawingml/2006/main">
-                <a:graphicData uri="http://schemas.microsoft.com/office/word/2010/wordprocessingShape">
-                  <wps:wsp>
-                    <wps:cNvSpPr/>
-                    <wps:spPr>
-                      <a:xfrm>
-                        <a:off x="0" y="0"/>
-                        <a:ext cx="2428875" cy="571500"/>
-                      </a:xfrm>
-                      <a:prstGeom prst="rect">
-                        <a:avLst/>
-                      </a:prstGeom>
-                      <a:solidFill>
-                        <a:srgbClr val="FFFFFF"/>
-                      </a:solidFill>
-                      <a:ln>
-                        <a:noFill/>
-                      </a:ln>
-                    </wps:spPr>
-                    <wps:txbx>
-                      <w:txbxContent>
-                        <w:p>
-                          <w:pPr>
-                            <w:spacing w:after="0" w:line="240" w:lineRule="auto"/>
-                            <w:jc w:val="right"/>
-                            <w:textDirection w:val="btLr"/>
-                          </w:pPr>
-                          <w:r>
-                            <w:rPr>
-                              <w:rFonts w:ascii="Arial" w:eastAsia="Arial" w:hAnsi="Arial" w:cs="Arial"/>
-                              <w:color w:val="000066"/>
-                              <w:sz w:val="14"/>
-                            </w:rPr>
-                            <w:t xml:space="preserve">Jalan Prof. </w:t>
-                          </w:r>
-                          <w:proofErr w:type="spellStart"/>
-                          <w:r>
-                            <w:rPr>
-                              <w:rFonts w:ascii="Arial" w:eastAsia="Arial" w:hAnsi="Arial" w:cs="Arial"/>
-                              <w:color w:val="000066"/>
-                              <w:sz w:val="14"/>
-                            </w:rPr>
-                            <w:t>Sudarto</w:t>
-                          </w:r>
-                          <w:proofErr w:type="spellEnd"/>
-                          <w:r>
-                            <w:rPr>
-                              <w:rFonts w:ascii="Arial" w:eastAsia="Arial" w:hAnsi="Arial" w:cs="Arial"/>
-                              <w:color w:val="000066"/>
-                              <w:sz w:val="14"/>
-                            </w:rPr>
-                            <w:t>, S.H.</w:t>
-                          </w:r>
-                        </w:p>
-                        <w:p>
-                          <w:pPr>
-                            <w:spacing w:after="0" w:line="240" w:lineRule="auto"/>
-                            <w:jc w:val="right"/>
-                            <w:textDirection w:val="btLr"/>
-                          </w:pPr>
-                          <w:proofErr w:type="spellStart"/>
-                          <w:r>
-                            <w:rPr>
-                              <w:rFonts w:ascii="Arial" w:eastAsia="Arial" w:hAnsi="Arial" w:cs="Arial"/>
-                              <w:color w:val="000066"/>
-                              <w:sz w:val="14"/>
-                            </w:rPr>
-                            <w:t>Tembalang</w:t>
-                          </w:r>
-                          <w:proofErr w:type="spellEnd"/>
-                          <w:r>
-                            <w:rPr>
-                              <w:rFonts w:ascii="Arial" w:eastAsia="Arial" w:hAnsi="Arial" w:cs="Arial"/>
-                              <w:color w:val="000066"/>
-                              <w:sz w:val="14"/>
-                            </w:rPr>
-                            <w:t xml:space="preserve"> Semarang Kode Pos 50275</w:t>
-                          </w:r>
-                        </w:p>
-                        <w:p>
-                          <w:pPr>
-                            <w:spacing w:after="0" w:line="240" w:lineRule="auto"/>
-                            <w:jc w:val="right"/>
-                            <w:textDirection w:val="btLr"/>
-                          </w:pPr>
-                          <w:r>
-                            <w:rPr>
-                              <w:rFonts w:ascii="Arial" w:eastAsia="Arial" w:hAnsi="Arial" w:cs="Arial"/>
-                              <w:color w:val="000066"/>
-                              <w:sz w:val="14"/>
-                            </w:rPr>
-                            <w:t xml:space="preserve">Tel. (024) 76480678, </w:t>
-                          </w:r>
-                          <w:proofErr w:type="spellStart"/>
-                          <w:r>
-                            <w:rPr>
-                              <w:rFonts w:ascii="Arial" w:eastAsia="Arial" w:hAnsi="Arial" w:cs="Arial"/>
-                              <w:color w:val="000066"/>
-                              <w:sz w:val="14"/>
-                            </w:rPr>
-                            <w:t>Faks</w:t>
-                          </w:r>
-                          <w:proofErr w:type="spellEnd"/>
-                          <w:r>
-                            <w:rPr>
-                              <w:rFonts w:ascii="Arial" w:eastAsia="Arial" w:hAnsi="Arial" w:cs="Arial"/>
-                              <w:color w:val="000066"/>
-                              <w:sz w:val="14"/>
-                            </w:rPr>
-                            <w:t>. (024) 7460053</w:t>
-                          </w:r>
-                        </w:p>
-                        <w:p>
-                          <w:pPr>
-                            <w:spacing w:after="0" w:line="240" w:lineRule="auto"/>
-                            <w:jc w:val="right"/>
-                            <w:textDirection w:val="btLr"/>
-                          </w:pPr>
-                          <w:r>
-                            <w:rPr>
-                              <w:rFonts w:ascii="Arial" w:eastAsia="Arial" w:hAnsi="Arial" w:cs="Arial"/>
-                              <w:color w:val="000066"/>
-                              <w:sz w:val="14"/>
-                              <w:u w:val="single"/>
-                            </w:rPr>
-                            <w:t>www.ft.undip.ac.id</w:t>
-                          </w:r>
-                          <w:r>
-                            <w:rPr>
-                              <w:rFonts w:ascii="Arial" w:eastAsia="Arial" w:hAnsi="Arial" w:cs="Arial"/>
-                              <w:color w:val="000066"/>
-                              <w:sz w:val="14"/>
-                            </w:rPr>
-                            <w:t xml:space="preserve"> | email: enveng@live.undip.ac.id</w:t>
-                          </w:r>
-                        </w:p>
-                      </w:txbxContent>
-                    </wps:txbx>
-                    <wps:bodyPr spcFirstLastPara="1" wrap="square" lIns="114300" tIns="0" rIns="114300" bIns="0" anchor="t" anchorCtr="0">
-                      <a:noAutofit/>
-                    </wps:bodyPr>
-                  </wps:wsp>
-                </a:graphicData>
-              </a:graphic>
-            </wp:anchor>
-          </w:drawing>
-        </mc:Choice>
-        <mc:Fallback>
-          <w:pict>
-            <v:rect w14:anchorId="18FC7E71" id="Rectangle 9" o:spid="_x0000_s1026" style="position:absolute;left:0;text-align:left;margin-left:300.2pt;margin-top:34.95pt;width:191.25pt;height:45pt;z-index:251658240;visibility:visible;mso-wrap-style:square;mso-wrap-distance-left:9pt;mso-wrap-distance-top:0;mso-wrap-distance-right:9pt;mso-wrap-distance-bottom:0;mso-position-horizontal:absolute;mso-position-horizontal-relative:text;mso-position-vertical:absolute;mso-position-vertical-relative:text;v-text-anchor:top" o:gfxdata="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" stroked="f">
-              <v:textbox inset="9pt,0,9pt,0">
-                <w:txbxContent>
-                  <w:p>
-                    <w:pPr>
-                      <w:spacing w:after="0" w:line="240" w:lineRule="auto"/>
-                      <w:jc w:val="right"/>
-                      <w:textDirection w:val="btLr"/>
-                    </w:pPr>
-                    <w:r>
-                      <w:rPr>
-                        <w:rFonts w:ascii="Arial" w:eastAsia="Arial" w:hAnsi="Arial" w:cs="Arial"/>
-                        <w:color w:val="000066"/>
-                        <w:sz w:val="14"/>
-                      </w:rPr>
-                      <w:t xml:space="preserve">Jalan Prof. </w:t>
-                    </w:r>
-                    <w:proofErr w:type="spellStart"/>
-                    <w:r>
-                      <w:rPr>
-                        <w:rFonts w:ascii="Arial" w:eastAsia="Arial" w:hAnsi="Arial" w:cs="Arial"/>
-                        <w:color w:val="000066"/>
-                        <w:sz w:val="14"/>
-                      </w:rPr>
-                      <w:t>Sudarto</w:t>
-                    </w:r>
-                    <w:proofErr w:type="spellEnd"/>
-                    <w:r>
-                      <w:rPr>
-                        <w:rFonts w:ascii="Arial" w:eastAsia="Arial" w:hAnsi="Arial" w:cs="Arial"/>
-                        <w:color w:val="000066"/>
-                        <w:sz w:val="14"/>
-                      </w:rPr>
-                      <w:t>, S.H.</w:t>
-                    </w:r>
-                  </w:p>
-                  <w:p>
-                    <w:pPr>
-                      <w:spacing w:after="0" w:line="240" w:lineRule="auto"/>
-                      <w:jc w:val="right"/>
-                      <w:textDirection w:val="btLr"/>
-                    </w:pPr>
-                    <w:proofErr w:type="spellStart"/>
-                    <w:r>
-                      <w:rPr>
-                        <w:rFonts w:ascii="Arial" w:eastAsia="Arial" w:hAnsi="Arial" w:cs="Arial"/>
-                        <w:color w:val="000066"/>
-                        <w:sz w:val="14"/>
-                      </w:rPr>
-                      <w:t>Tembalang</w:t>
-                    </w:r>
-                    <w:proofErr w:type="spellEnd"/>
-                    <w:r>
-                      <w:rPr>
-                        <w:rFonts w:ascii="Arial" w:eastAsia="Arial" w:hAnsi="Arial" w:cs="Arial"/>
-                        <w:color w:val="000066"/>
-                        <w:sz w:val="14"/>
-                      </w:rPr>
-                      <w:t xml:space="preserve"> Semarang Kode Pos 50275</w:t>
-                    </w:r>
-                  </w:p>
-                  <w:p>
-                    <w:pPr>
-                      <w:spacing w:after="0" w:line="240" w:lineRule="auto"/>
-                      <w:jc w:val="right"/>
-                      <w:textDirection w:val="btLr"/>
-                    </w:pPr>
-                    <w:r>
-                      <w:rPr>
-                        <w:rFonts w:ascii="Arial" w:eastAsia="Arial" w:hAnsi="Arial" w:cs="Arial"/>
-                        <w:color w:val="000066"/>
-                        <w:sz w:val="14"/>
-                      </w:rPr>
-                      <w:t xml:space="preserve">Tel. (024) 76480678, </w:t>
-                    </w:r>
-                    <w:proofErr w:type="spellStart"/>
-                    <w:r>
-                      <w:rPr>
-                        <w:rFonts w:ascii="Arial" w:eastAsia="Arial" w:hAnsi="Arial" w:cs="Arial"/>
-                        <w:color w:val="000066"/>
-                        <w:sz w:val="14"/>
-                      </w:rPr>
-                      <w:t>Faks</w:t>
-                    </w:r>
-                    <w:proofErr w:type="spellEnd"/>
-                    <w:r>
-                      <w:rPr>
-                        <w:rFonts w:ascii="Arial" w:eastAsia="Arial" w:hAnsi="Arial" w:cs="Arial"/>
-                        <w:color w:val="000066"/>
-                        <w:sz w:val="14"/>
-                      </w:rPr>
-                      <w:t>. (024) 7460053</w:t>
-                    </w:r>
-                  </w:p>
-                  <w:p>
-                    <w:pPr>
-                      <w:spacing w:after="0" w:line="240" w:lineRule="auto"/>
-                      <w:jc w:val="right"/>
-                      <w:textDirection w:val="btLr"/>
-                    </w:pPr>
-                    <w:r>
-                      <w:rPr>
-                        <w:rFonts w:ascii="Arial" w:eastAsia="Arial" w:hAnsi="Arial" w:cs="Arial"/>
-                        <w:color w:val="000066"/>
-                        <w:sz w:val="14"/>
-                        <w:u w:val="single"/>
-                      </w:rPr>
-                      <w:t>www.ft.undip.ac.id</w:t>
-                    </w:r>
-                    <w:r>
-                      <w:rPr>
-                        <w:rFonts w:ascii="Arial" w:eastAsia="Arial" w:hAnsi="Arial" w:cs="Arial"/>
-                        <w:color w:val="000066"/>
-                        <w:sz w:val="14"/>
-                      </w:rPr>
-                      <w:t xml:space="preserve"> | email: enveng@live.undip.ac.id</w:t>
-                    </w:r>
-                  </w:p>
-                </w:txbxContent>
-              </v:textbox>
-            </v:rect>
-          </w:pict>
-        </mc:Fallback>
-      </mc:AlternateContent>
-    </w:r>
-    <w:r>
-      <w:rPr>
-        <w:noProof/>
-      </w:rPr>
-      <mc:AlternateContent>
-        <mc:Choice Requires="wps">
-          <w:drawing>
-            <wp:anchor distT="0" distB="0" distL="114300" distR="114300" simplePos="0" relativeHeight="251659264" behindDoc="0" locked="0" layoutInCell="1" hidden="0" allowOverlap="1" wp14:anchorId="666C1B3C" wp14:editId="029E6A2A">
-              <wp:simplePos x="0" y="0"/>
-              <wp:positionH relativeFrom="column">
-                <wp:posOffset>312006</wp:posOffset>
-              </wp:positionH>
-              <wp:positionV relativeFrom="paragraph">
-                <wp:posOffset>4194</wp:posOffset>
-              </wp:positionV>
-              <wp:extent cx="3657600" cy="985838"/>
-              <wp:effectExtent l="0" t="0" r="0" b="0"/>
-              <wp:wrapNone/>
-              <wp:docPr id="10" name="Freeform: Shape 10"/>
-              <wp:cNvGraphicFramePr/>
-              <a:graphic xmlns:a="http://schemas.openxmlformats.org/drawingml/2006/main">
-                <a:graphicData uri="http://schemas.microsoft.com/office/word/2010/wordprocessingShape">
-                  <wps:wsp>
-                    <wps:cNvSpPr/>
-                    <wps:spPr>
-                      <a:xfrm>
-                        <a:off x="0" y="0"/>
-                        <a:ext cx="3657600" cy="985838"/>
-                      </a:xfrm>
-                      <a:custGeom>
-                        <a:avLst/>
-                        <a:gdLst/>
-                        <a:ahLst/>
-                        <a:cxnLst/>
-                        <a:rect l="l" t="t" r="r" b="b"/>
-                        <a:pathLst>
-                          <a:path w="3648075" h="1067435" extrusionOk="0">
-                            <a:moveTo>
-                              <a:pt x="0" y="0"/>
-                            </a:moveTo>
-                            <a:lnTo>
-                              <a:pt x="0" y="1067435"/>
-                            </a:lnTo>
-                            <a:lnTo>
-                              <a:pt x="3648075" y="1067435"/>
-                            </a:lnTo>
-                            <a:lnTo>
-                              <a:pt x="3648075" y="0"/>
-                            </a:lnTo>
-                            <a:close/>
-                          </a:path>
-                        </a:pathLst>
-                      </a:custGeom>
-                      <a:solidFill>
-                        <a:srgbClr val="FFFFFF"/>
-                      </a:solidFill>
-                      <a:ln>
-                        <a:noFill/>
-                      </a:ln>
-                    </wps:spPr>
-                    <wps:txbx>
-                      <w:txbxContent>
-                        <w:p>
-                          <w:pPr>
-                            <w:spacing w:after="0" w:line="240" w:lineRule="auto"/>
-                            <w:jc w:val="both"/>
-                            <w:textDirection w:val="btLr"/>
-                          </w:pPr>
-                          <w:r>
-                            <w:rPr>
-                              <w:rFonts w:ascii="Times New Roman" w:eastAsia="Times New Roman" w:hAnsi="Times New Roman" w:cs="Times New Roman"/>
-                              <w:b/>
-                              <w:color w:val="000066"/>
-                              <w:sz w:val="24"/>
-                            </w:rPr>
-                            <w:t>KEMENTERIAN PENDIDIKAN TINGGI, SAINS, DAN TEKNOLOGI</w:t>
-                          </w:r>
-                        </w:p>
-                        <w:p>
-                          <w:pPr>
-                            <w:spacing w:after="0" w:line="240" w:lineRule="auto"/>
-                            <w:jc w:val="both"/>
-                            <w:textDirection w:val="btLr"/>
-                          </w:pPr>
-                          <w:r>
-                            <w:rPr>
-                              <w:rFonts w:ascii="Times New Roman" w:eastAsia="Times New Roman" w:hAnsi="Times New Roman" w:cs="Times New Roman"/>
-                              <w:b/>
-                              <w:color w:val="000066"/>
-                              <w:sz w:val="24"/>
-                            </w:rPr>
-                            <w:t>UNIVERSITAS DIPONEGORO</w:t>
-                          </w:r>
-                        </w:p>
-                        <w:p>
-                          <w:pPr>
-                            <w:spacing w:after="0" w:line="240" w:lineRule="auto"/>
-                            <w:jc w:val="both"/>
-                            <w:textDirection w:val="btLr"/>
-                          </w:pPr>
-                          <w:r>
-                            <w:rPr>
-                              <w:rFonts w:ascii="Times New Roman" w:eastAsia="Times New Roman" w:hAnsi="Times New Roman" w:cs="Times New Roman"/>
-                              <w:b/>
-                              <w:color w:val="000066"/>
-                              <w:sz w:val="24"/>
-                            </w:rPr>
-                            <w:t>FAKULTAS TEKNIK</w:t>
-                          </w:r>
-                        </w:p>
-                        <w:p>
-                          <w:pPr>
-                            <w:spacing w:after="0" w:line="240" w:lineRule="auto"/>
-                            <w:jc w:val="both"/>
-                            <w:textDirection w:val="btLr"/>
-                          </w:pPr>
-                          <w:r>
-                            <w:rPr>
-                              <w:rFonts w:ascii="Times New Roman" w:eastAsia="Times New Roman" w:hAnsi="Times New Roman" w:cs="Times New Roman"/>
-                              <w:b/>
-                              <w:color w:val="000066"/>
-                              <w:sz w:val="28"/>
-                            </w:rPr>
-                            <w:t>DEPARTEMEN TEKNIK LINGKUNGAN</w:t>
-                          </w:r>
-                        </w:p>
-                      </w:txbxContent>
-                    </wps:txbx>
-                    <wps:bodyPr spcFirstLastPara="1" wrap="square" lIns="114300" tIns="0" rIns="114300" bIns="0" anchor="t" anchorCtr="0">
-                      <a:noAutofit/>
-                    </wps:bodyPr>
-                  </wps:wsp>
-                </a:graphicData>
-              </a:graphic>
-            </wp:anchor>
-          </w:drawing>
-        </mc:Choice>
-        <mc:Fallback>
-          <w:pict>
-            <v:shape w14:anchorId="666C1B3C" id="Freeform: Shape 10" o:spid="_x0000_s1027" style="position:absolute;left:0;text-align:left;margin-left:24.55pt;margin-top:.35pt;width:4in;height:77.65pt;z-index:251659264;visibility:visible;mso-wrap-style:square;mso-wrap-distance-left:9pt;mso-wrap-distance-top:0;mso-wrap-distance-right:9pt;mso-wrap-distance-bottom:0;mso-position-horizontal:absolute;mso-position-horizontal-relative:text;mso-position-vertical:absolute;mso-position-vertical-relative:text;v-text-anchor:top" coordsize="3648075,1067435" o:spt="100" o:gfxdata="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" adj="-11796480,,5400" path="m,l,1067435r3648075,l3648075,,,xe" stroked="f">
-              <v:stroke joinstyle="miter"/>
-              <v:formulas/>
-              <v:path arrowok="t" o:extrusionok="f" o:connecttype="custom" textboxrect="0,0,3648075,1067435"/>
-              <v:textbox inset="9pt,0,9pt,0">
-                <w:txbxContent>
-                  <w:p>
-                    <w:pPr>
-                      <w:spacing w:after="0" w:line="240" w:lineRule="auto"/>
-                      <w:jc w:val="both"/>
-                      <w:textDirection w:val="btLr"/>
-                    </w:pPr>
-                    <w:r>
-                      <w:rPr>
-                        <w:rFonts w:ascii="Times New Roman" w:eastAsia="Times New Roman" w:hAnsi="Times New Roman" w:cs="Times New Roman"/>
-                        <w:b/>
-                        <w:color w:val="000066"/>
-                        <w:sz w:val="24"/>
-                      </w:rPr>
-                      <w:t>KEMENTERIAN PENDIDIKAN TINGGI, SAINS, DAN TEKNOLOGI</w:t>
-                    </w:r>
-                  </w:p>
-                  <w:p>
-                    <w:pPr>
-                      <w:spacing w:after="0" w:line="240" w:lineRule="auto"/>
-                      <w:jc w:val="both"/>
-                      <w:textDirection w:val="btLr"/>
-                    </w:pPr>
-                    <w:r>
-                      <w:rPr>
-                        <w:rFonts w:ascii="Times New Roman" w:eastAsia="Times New Roman" w:hAnsi="Times New Roman" w:cs="Times New Roman"/>
-                        <w:b/>
-                        <w:color w:val="000066"/>
-                        <w:sz w:val="24"/>
-                      </w:rPr>
-                      <w:t>UNIVERSITAS DIPONEGORO</w:t>
-                    </w:r>
-                  </w:p>
-                  <w:p>
-                    <w:pPr>
-                      <w:spacing w:after="0" w:line="240" w:lineRule="auto"/>
-                      <w:jc w:val="both"/>
-                      <w:textDirection w:val="btLr"/>
-                    </w:pPr>
-                    <w:r>
-                      <w:rPr>
-                        <w:rFonts w:ascii="Times New Roman" w:eastAsia="Times New Roman" w:hAnsi="Times New Roman" w:cs="Times New Roman"/>
-                        <w:b/>
-                        <w:color w:val="000066"/>
-                        <w:sz w:val="24"/>
-                      </w:rPr>
-                      <w:t>FAKULTAS TEKNIK</w:t>
-                    </w:r>
-                  </w:p>
-                  <w:p>
-                    <w:pPr>
-                      <w:spacing w:after="0" w:line="240" w:lineRule="auto"/>
-                      <w:jc w:val="both"/>
-                      <w:textDirection w:val="btLr"/>
-                    </w:pPr>
-                    <w:r>
-                      <w:rPr>
-                        <w:rFonts w:ascii="Times New Roman" w:eastAsia="Times New Roman" w:hAnsi="Times New Roman" w:cs="Times New Roman"/>
-                        <w:b/>
-                        <w:color w:val="000066"/>
-                        <w:sz w:val="28"/>
-                      </w:rPr>
-                      <w:t>DEPARTEMEN TEKNIK LINGKUNGAN</w:t>
-                    </w:r>
-                  </w:p>
-                </w:txbxContent>
-              </v:textbox>
-            </v:shape>
-          </w:pict>
-        </mc:Fallback>
-      </mc:AlternateContent>
-    </w:r>
-    <w:r>
-      <w:rPr>
-        <w:noProof/>
-        <w:color w:val="000000"/>
-      </w:rPr>
-      <w:drawing>
-        <wp:inline distT="0" distB="0" distL="0" distR="0" wp14:anchorId="6EEA7EB3" wp14:editId="096CA673">
-          <wp:extent cx="853033" cy="933450"/>
-          <wp:effectExtent l="0" t="0" r="0" b="0"/>
-          <wp:docPr id="11" name="image1.png" descr="Undip.png"/>
-          <wp:cNvGraphicFramePr/>
-          <a:graphic xmlns:a="http://schemas.openxmlformats.org/drawingml/2006/main">
-            <a:graphicData uri="http://schemas.openxmlformats.org/drawingml/2006/picture">
-              <pic:pic xmlns:pic="http://schemas.openxmlformats.org/drawingml/2006/picture">
-                <pic:nvPicPr>
-                  <pic:cNvPr id="0" name="image1.png" descr="Undip.png"/>
-                  <pic:cNvPicPr preferRelativeResize="0"/>
-                </pic:nvPicPr>
-                <pic:blipFill>
-                  <a:blip r:embed="rId1"/>
-                  <a:srcRect/>
-                  <a:stretch>
-                    <a:fillRect/>
-                  </a:stretch>
-                </pic:blipFill>
-                <pic:spPr>
-                  <a:xfrm>
-                    <a:off x="0" y="0"/>
-                    <a:ext cx="853033" cy="933450"/>
-                  </a:xfrm>
-                  <a:prstGeom prst="rect">
-                    <a:avLst/>
-                  </a:prstGeom>
-                  <a:ln/>
-                </pic:spPr>
-              </pic:pic>
-            </a:graphicData>
-          </a:graphic>
-        </wp:inline>
-      </w:drawing>
-    </w:r>
-    <w:bookmarkStart w:id="0" w:name="_heading=h.gjdgxs" w:colFirst="0" w:colLast="0"/>
-    <w:bookmarkEnd w:id="0"/>
-  </w:p>
-  <w:p>
-    <w:pPr>
-      <w:pBdr>
-        <w:top w:val="nil"/>
-        <w:left w:val="nil"/>
-        <w:bottom w:val="nil"/>
-        <w:right w:val="nil"/>
-        <w:between w:val="nil"/>
-      </w:pBdr>
-      <w:tabs>
-        <w:tab w:val="center" w:pos="4680"/>
-        <w:tab w:val="right" w:pos="9360"/>
-      </w:tabs>
-      <w:spacing w:after="0" w:line="240" w:lineRule="auto"/>
-      <w:rPr>
-        <w:color w:val="000000"/>
-      </w:rPr>
+      <w:pStyle w:val="Header"/>
     </w:pPr>
   </w:p>
 </w:hdr>
+</file>
+
+<file path=word/numbering.xml><?xml version="1.0" encoding="utf-8"?>
+<w:numbering xmlns:wpc="http://schemas.microsoft.com/office/word/2010/wordprocessingCanvas" xmlns:cx="http://schemas.microsoft.com/office/drawing/2014/chartex" xmlns:cx1="http://schemas.microsoft.com/office/drawing/2015/9/8/chartex" xmlns:cx2="http://schemas.microsoft.com/office/drawing/2015/10/21/chartex" xmlns:cx3="http://schemas.microsoft.com/office/drawing/2016/5/9/chartex" xmlns:cx4="http://schemas.microsoft.com/office/drawing/2016/5/10/chartex" xmlns:cx5="http://schemas.microsoft.com/office/drawing/2016/5/11/chartex" xmlns:cx6="http://schemas.microsoft.com/office/drawing/2016/5/12/chartex" xmlns:cx7="http://schemas.microsoft.com/office/drawing/2016/5/13/chartex" xmlns:cx8="http://schemas.microsoft.com/office/drawing/2016/5/14/chartex" xmlns:mc="http://schemas.openxmlformats.org/markup-compatibility/2006" xmlns:aink="http://schemas.microsoft.com/office/drawing/2016/ink" xmlns:am3d="http://schemas.microsoft.com/office/drawing/2017/model3d" xmlns:o="urn:schemas-microsoft-com:office:office" xmlns:oel="http://schemas.microsoft.com/office/2019/extlst" xmlns:r="http://schemas.openxmlformats.org/officeDocument/2006/relationships" xmlns:m="http://schemas.openxmlformats.org/officeDocument/2006/math" xmlns:v="urn:schemas-microsoft-com:vml" xmlns:wp14="http://schemas.microsoft.com/office/word/2010/wordprocessingDrawing" xmlns:wp="http://schemas.openxmlformats.org/drawingml/2006/wordprocessingDrawing" xmlns:w10="urn:schemas-microsoft-com:office:word" xmlns:w="http://schemas.openxmlformats.org/wordprocessingml/2006/main" xmlns:w14="http://schemas.microsoft.com/office/word/2010/wordml" xmlns:w15="http://schemas.microsoft.com/office/word/2012/wordml" xmlns:w16cex="http://schemas.microsoft.com/office/word/2018/wordml/cex" xmlns:w16cid="http://schemas.microsoft.com/office/word/2016/wordml/cid" xmlns:w16="http://schemas.microsoft.com/office/word/2018/wordml" xmlns:w16du="http://schemas.microsoft.com/office/word/2023/wordml/word16du" xmlns:w16sdtdh="http://schemas.microsoft.com/office/word/2020/wordml/sdtdatahash" xmlns:w16sdtfl="http://schemas.microsoft.com/office/word/2024/wordml/sdtformatlock" xmlns:w16se="http://schemas.microsoft.com/office/word/2015/wordml/symex" xmlns:wpg="http://schemas.microsoft.com/office/word/2010/wordprocessingGroup" xmlns:wpi="http://schemas.microsoft.com/office/word/2010/wordprocessingInk" xmlns:wne="http://schemas.microsoft.com/office/word/2006/wordml" xmlns:wps="http://schemas.microsoft.com/office/word/2010/wordprocessingShape" mc:Ignorable="w14 w15 w16se w16cid w16 w16cex w16sdtdh w16sdtfl w16du wp14">
+  <w:abstractNum w:abstractNumId="0" w15:restartNumberingAfterBreak="0">
+    <w:nsid w:val="52222E9E"/>
+    <w:multiLevelType w:val="hybridMultilevel"/>
+    <w:tmpl w:val="80B88ED4"/>
+    <w:lvl w:ilvl="0" w:tplc="0409000F">
+      <w:start w:val="1"/>
+      <w:numFmt w:val="decimal"/>
+      <w:lvlText w:val="%1."/>
+      <w:lvlJc w:val="left"/>
+      <w:pPr>
+        <w:ind w:left="720" w:hanging="360"/>
+      </w:pPr>
+      <w:rPr>
+        <w:rFonts w:hint="default"/>
+      </w:rPr>
+    </w:lvl>
+    <w:lvl w:ilvl="1" w:tplc="04090019" w:tentative="1">
+      <w:start w:val="1"/>
+      <w:numFmt w:val="lowerLetter"/>
+      <w:lvlText w:val="%2."/>
+      <w:lvlJc w:val="left"/>
+      <w:pPr>
+        <w:ind w:left="1440" w:hanging="360"/>
+      </w:pPr>
+    </w:lvl>
+    <w:lvl w:ilvl="2" w:tplc="0409001B" w:tentative="1">
+      <w:start w:val="1"/>
+      <w:numFmt w:val="lowerRoman"/>
+      <w:lvlText w:val="%3."/>
+      <w:lvlJc w:val="right"/>
+      <w:pPr>
+        <w:ind w:left="2160" w:hanging="180"/>
+      </w:pPr>
+    </w:lvl>
+    <w:lvl w:ilvl="3" w:tplc="0409000F" w:tentative="1">
+      <w:start w:val="1"/>
+      <w:numFmt w:val="decimal"/>
+      <w:lvlText w:val="%4."/>
+      <w:lvlJc w:val="left"/>
+      <w:pPr>
+        <w:ind w:left="2880" w:hanging="360"/>
+      </w:pPr>
+    </w:lvl>
+    <w:lvl w:ilvl="4" w:tplc="04090019" w:tentative="1">
+      <w:start w:val="1"/>
+      <w:numFmt w:val="lowerLetter"/>
+      <w:lvlText w:val="%5."/>
+      <w:lvlJc w:val="left"/>
+      <w:pPr>
+        <w:ind w:left="3600" w:hanging="360"/>
+      </w:pPr>
+    </w:lvl>
+    <w:lvl w:ilvl="5" w:tplc="0409001B" w:tentative="1">
+      <w:start w:val="1"/>
+      <w:numFmt w:val="lowerRoman"/>
+      <w:lvlText w:val="%6."/>
+      <w:lvlJc w:val="right"/>
+      <w:pPr>
+        <w:ind w:left="4320" w:hanging="180"/>
+      </w:pPr>
+    </w:lvl>
+    <w:lvl w:ilvl="6" w:tplc="0409000F" w:tentative="1">
+      <w:start w:val="1"/>
+      <w:numFmt w:val="decimal"/>
+      <w:lvlText w:val="%7."/>
+      <w:lvlJc w:val="left"/>
+      <w:pPr>
+        <w:ind w:left="5040" w:hanging="360"/>
+      </w:pPr>
+    </w:lvl>
+    <w:lvl w:ilvl="7" w:tplc="04090019" w:tentative="1">
+      <w:start w:val="1"/>
+      <w:numFmt w:val="lowerLetter"/>
+      <w:lvlText w:val="%8."/>
+      <w:lvlJc w:val="left"/>
+      <w:pPr>
+        <w:ind w:left="5760" w:hanging="360"/>
+      </w:pPr>
+    </w:lvl>
+    <w:lvl w:ilvl="8" w:tplc="0409001B" w:tentative="1">
+      <w:start w:val="1"/>
+      <w:numFmt w:val="lowerRoman"/>
+      <w:lvlText w:val="%9."/>
+      <w:lvlJc w:val="right"/>
+      <w:pPr>
+        <w:ind w:left="6480" w:hanging="180"/>
+      </w:pPr>
+    </w:lvl>
+  </w:abstractNum>
+  <w:num w:numId="1" w16cid:durableId="203447174">
+    <w:abstractNumId w:val="0"/>
+  </w:num>
+</w:numbering>
 </file>
 
 <file path=word/styles.xml><?xml version="1.0" encoding="utf-8"?>
@@ -1837,15 +1967,15 @@
   <w:docDefaults>
     <w:rPrDefault>
       <w:rPr>
-        <w:rFonts w:ascii="Calibri" w:eastAsia="Calibri" w:hAnsi="Calibri" w:cs="Calibri"/>
+        <w:rFonts w:ascii="Abadi Extra Light" w:eastAsiaTheme="minorEastAsia" w:hAnsi="Abadi Extra Light" w:cstheme="minorBidi"/>
         <w:sz w:val="22"/>
         <w:szCs w:val="22"/>
-        <w:lang w:val="en-US" w:eastAsia="en-ID" w:bidi="ar-SA"/>
+        <w:lang w:val="en-US" w:eastAsia="en-US" w:bidi="ar-SA"/>
       </w:rPr>
     </w:rPrDefault>
     <w:pPrDefault>
       <w:pPr>
-        <w:spacing w:after="200" w:line="360" w:lineRule="auto"/>
+        <w:spacing w:after="-1" w:line="259" w:lineRule="auto"/>
       </w:pPr>
     </w:pPrDefault>
   </w:docDefaults>
@@ -1916,7 +2046,7 @@
     <w:lsdException w:name="Closing" w:semiHidden="1" w:unhideWhenUsed="1"/>
     <w:lsdException w:name="Signature" w:semiHidden="1" w:unhideWhenUsed="1"/>
     <w:lsdException w:name="Default Paragraph Font" w:semiHidden="1" w:uiPriority="1" w:unhideWhenUsed="1"/>
-    <w:lsdException w:name="Body Text" w:semiHidden="1" w:unhideWhenUsed="1"/>
+    <w:lsdException w:name="Body Text" w:semiHidden="1" w:uiPriority="1" w:unhideWhenUsed="1" w:qFormat="1"/>
     <w:lsdException w:name="Body Text Indent" w:semiHidden="1" w:unhideWhenUsed="1"/>
     <w:lsdException w:name="List Continue" w:semiHidden="1" w:unhideWhenUsed="1"/>
     <w:lsdException w:name="List Continue 2" w:semiHidden="1" w:unhideWhenUsed="1"/>
@@ -2230,62 +2360,71 @@
   <w:style w:type="paragraph" w:default="1" w:styleId="Normal">
     <w:name w:val="Normal"/>
     <w:qFormat/>
-    <w:rsid w:val="00A36581"/>
+    <w:rsid w:val="00FE131D"/>
   </w:style>
   <w:style w:type="paragraph" w:styleId="Heading1">
     <w:name w:val="heading 1"/>
     <w:basedOn w:val="Normal"/>
     <w:next w:val="Normal"/>
+    <w:link w:val="Heading1Char"/>
     <w:uiPriority w:val="9"/>
     <w:qFormat/>
+    <w:rsid w:val="00FE131D"/>
     <w:pPr>
       <w:keepNext/>
       <w:keepLines/>
-      <w:spacing w:before="480" w:after="120"/>
+      <w:spacing w:before="400" w:after="40" w:line="240" w:lineRule="auto"/>
       <w:outlineLvl w:val="0"/>
     </w:pPr>
     <w:rPr>
-      <w:b/>
-      <w:sz w:val="48"/>
-      <w:szCs w:val="48"/>
+      <w:rFonts w:asciiTheme="majorHAnsi" w:eastAsiaTheme="majorEastAsia" w:hAnsiTheme="majorHAnsi" w:cstheme="majorBidi"/>
+      <w:color w:val="244061" w:themeColor="accent1" w:themeShade="80"/>
+      <w:sz w:val="36"/>
+      <w:szCs w:val="36"/>
     </w:rPr>
   </w:style>
   <w:style w:type="paragraph" w:styleId="Heading2">
     <w:name w:val="heading 2"/>
     <w:basedOn w:val="Normal"/>
     <w:next w:val="Normal"/>
+    <w:link w:val="Heading2Char"/>
     <w:uiPriority w:val="9"/>
     <w:semiHidden/>
     <w:unhideWhenUsed/>
     <w:qFormat/>
+    <w:rsid w:val="00FE131D"/>
     <w:pPr>
       <w:keepNext/>
       <w:keepLines/>
-      <w:spacing w:before="360" w:after="80"/>
+      <w:spacing w:before="40" w:after="0" w:line="240" w:lineRule="auto"/>
       <w:outlineLvl w:val="1"/>
     </w:pPr>
     <w:rPr>
-      <w:b/>
-      <w:sz w:val="36"/>
-      <w:szCs w:val="36"/>
+      <w:rFonts w:asciiTheme="majorHAnsi" w:eastAsiaTheme="majorEastAsia" w:hAnsiTheme="majorHAnsi" w:cstheme="majorBidi"/>
+      <w:color w:val="365F91" w:themeColor="accent1" w:themeShade="BF"/>
+      <w:sz w:val="32"/>
+      <w:szCs w:val="32"/>
     </w:rPr>
   </w:style>
   <w:style w:type="paragraph" w:styleId="Heading3">
     <w:name w:val="heading 3"/>
     <w:basedOn w:val="Normal"/>
     <w:next w:val="Normal"/>
+    <w:link w:val="Heading3Char"/>
     <w:uiPriority w:val="9"/>
     <w:semiHidden/>
     <w:unhideWhenUsed/>
     <w:qFormat/>
+    <w:rsid w:val="00FE131D"/>
     <w:pPr>
       <w:keepNext/>
       <w:keepLines/>
-      <w:spacing w:before="280" w:after="80"/>
+      <w:spacing w:before="40" w:after="0" w:line="240" w:lineRule="auto"/>
       <w:outlineLvl w:val="2"/>
     </w:pPr>
     <w:rPr>
-      <w:b/>
+      <w:rFonts w:asciiTheme="majorHAnsi" w:eastAsiaTheme="majorEastAsia" w:hAnsiTheme="majorHAnsi" w:cstheme="majorBidi"/>
+      <w:color w:val="365F91" w:themeColor="accent1" w:themeShade="BF"/>
       <w:sz w:val="28"/>
       <w:szCs w:val="28"/>
     </w:rPr>
@@ -2294,18 +2433,21 @@
     <w:name w:val="heading 4"/>
     <w:basedOn w:val="Normal"/>
     <w:next w:val="Normal"/>
+    <w:link w:val="Heading4Char"/>
     <w:uiPriority w:val="9"/>
     <w:semiHidden/>
     <w:unhideWhenUsed/>
     <w:qFormat/>
+    <w:rsid w:val="00FE131D"/>
     <w:pPr>
       <w:keepNext/>
       <w:keepLines/>
-      <w:spacing w:before="240" w:after="40"/>
+      <w:spacing w:before="40" w:after="0"/>
       <w:outlineLvl w:val="3"/>
     </w:pPr>
     <w:rPr>
-      <w:b/>
+      <w:rFonts w:asciiTheme="majorHAnsi" w:eastAsiaTheme="majorEastAsia" w:hAnsiTheme="majorHAnsi" w:cstheme="majorBidi"/>
+      <w:color w:val="365F91" w:themeColor="accent1" w:themeShade="BF"/>
       <w:sz w:val="24"/>
       <w:szCs w:val="24"/>
     </w:rPr>
@@ -2314,38 +2456,117 @@
     <w:name w:val="heading 5"/>
     <w:basedOn w:val="Normal"/>
     <w:next w:val="Normal"/>
+    <w:link w:val="Heading5Char"/>
     <w:uiPriority w:val="9"/>
     <w:semiHidden/>
     <w:unhideWhenUsed/>
     <w:qFormat/>
+    <w:rsid w:val="00FE131D"/>
     <w:pPr>
       <w:keepNext/>
       <w:keepLines/>
-      <w:spacing w:before="220" w:after="40"/>
+      <w:spacing w:before="40" w:after="0"/>
       <w:outlineLvl w:val="4"/>
     </w:pPr>
     <w:rPr>
-      <w:b/>
+      <w:rFonts w:asciiTheme="majorHAnsi" w:eastAsiaTheme="majorEastAsia" w:hAnsiTheme="majorHAnsi" w:cstheme="majorBidi"/>
+      <w:caps/>
+      <w:color w:val="365F91" w:themeColor="accent1" w:themeShade="BF"/>
     </w:rPr>
   </w:style>
   <w:style w:type="paragraph" w:styleId="Heading6">
     <w:name w:val="heading 6"/>
     <w:basedOn w:val="Normal"/>
     <w:next w:val="Normal"/>
+    <w:link w:val="Heading6Char"/>
     <w:uiPriority w:val="9"/>
     <w:semiHidden/>
     <w:unhideWhenUsed/>
     <w:qFormat/>
+    <w:rsid w:val="00FE131D"/>
     <w:pPr>
       <w:keepNext/>
       <w:keepLines/>
-      <w:spacing w:before="200" w:after="40"/>
+      <w:spacing w:before="40" w:after="0"/>
       <w:outlineLvl w:val="5"/>
     </w:pPr>
     <w:rPr>
+      <w:rFonts w:asciiTheme="majorHAnsi" w:eastAsiaTheme="majorEastAsia" w:hAnsiTheme="majorHAnsi" w:cstheme="majorBidi"/>
+      <w:i/>
+      <w:iCs/>
+      <w:caps/>
+      <w:color w:val="244061" w:themeColor="accent1" w:themeShade="80"/>
+    </w:rPr>
+  </w:style>
+  <w:style w:type="paragraph" w:styleId="Heading7">
+    <w:name w:val="heading 7"/>
+    <w:basedOn w:val="Normal"/>
+    <w:next w:val="Normal"/>
+    <w:link w:val="Heading7Char"/>
+    <w:uiPriority w:val="9"/>
+    <w:semiHidden/>
+    <w:unhideWhenUsed/>
+    <w:qFormat/>
+    <w:rsid w:val="00FE131D"/>
+    <w:pPr>
+      <w:keepNext/>
+      <w:keepLines/>
+      <w:spacing w:before="40" w:after="0"/>
+      <w:outlineLvl w:val="6"/>
+    </w:pPr>
+    <w:rPr>
+      <w:rFonts w:asciiTheme="majorHAnsi" w:eastAsiaTheme="majorEastAsia" w:hAnsiTheme="majorHAnsi" w:cstheme="majorBidi"/>
       <w:b/>
-      <w:sz w:val="20"/>
-      <w:szCs w:val="20"/>
+      <w:bCs/>
+      <w:color w:val="244061" w:themeColor="accent1" w:themeShade="80"/>
+    </w:rPr>
+  </w:style>
+  <w:style w:type="paragraph" w:styleId="Heading8">
+    <w:name w:val="heading 8"/>
+    <w:basedOn w:val="Normal"/>
+    <w:next w:val="Normal"/>
+    <w:link w:val="Heading8Char"/>
+    <w:uiPriority w:val="9"/>
+    <w:semiHidden/>
+    <w:unhideWhenUsed/>
+    <w:qFormat/>
+    <w:rsid w:val="00FE131D"/>
+    <w:pPr>
+      <w:keepNext/>
+      <w:keepLines/>
+      <w:spacing w:before="40" w:after="0"/>
+      <w:outlineLvl w:val="7"/>
+    </w:pPr>
+    <w:rPr>
+      <w:rFonts w:asciiTheme="majorHAnsi" w:eastAsiaTheme="majorEastAsia" w:hAnsiTheme="majorHAnsi" w:cstheme="majorBidi"/>
+      <w:b/>
+      <w:bCs/>
+      <w:i/>
+      <w:iCs/>
+      <w:color w:val="244061" w:themeColor="accent1" w:themeShade="80"/>
+    </w:rPr>
+  </w:style>
+  <w:style w:type="paragraph" w:styleId="Heading9">
+    <w:name w:val="heading 9"/>
+    <w:basedOn w:val="Normal"/>
+    <w:next w:val="Normal"/>
+    <w:link w:val="Heading9Char"/>
+    <w:uiPriority w:val="9"/>
+    <w:semiHidden/>
+    <w:unhideWhenUsed/>
+    <w:qFormat/>
+    <w:rsid w:val="00FE131D"/>
+    <w:pPr>
+      <w:keepNext/>
+      <w:keepLines/>
+      <w:spacing w:before="40" w:after="0"/>
+      <w:outlineLvl w:val="8"/>
+    </w:pPr>
+    <w:rPr>
+      <w:rFonts w:asciiTheme="majorHAnsi" w:eastAsiaTheme="majorEastAsia" w:hAnsiTheme="majorHAnsi" w:cstheme="majorBidi"/>
+      <w:i/>
+      <w:iCs/>
+      <w:color w:val="244061" w:themeColor="accent1" w:themeShade="80"/>
     </w:rPr>
   </w:style>
   <w:style w:type="character" w:default="1" w:styleId="DefaultParagraphFont">
@@ -2375,23 +2596,6 @@
     <w:semiHidden/>
     <w:unhideWhenUsed/>
   </w:style>
-  <w:style w:type="paragraph" w:styleId="Title">
-    <w:name w:val="Title"/>
-    <w:basedOn w:val="Normal"/>
-    <w:next w:val="Normal"/>
-    <w:uiPriority w:val="10"/>
-    <w:qFormat/>
-    <w:pPr>
-      <w:keepNext/>
-      <w:keepLines/>
-      <w:spacing w:before="480" w:after="120"/>
-    </w:pPr>
-    <w:rPr>
-      <w:b/>
-      <w:sz w:val="72"/>
-      <w:szCs w:val="72"/>
-    </w:rPr>
-  </w:style>
   <w:style w:type="paragraph" w:styleId="Header">
     <w:name w:val="header"/>
     <w:basedOn w:val="Normal"/>
@@ -2477,34 +2681,489 @@
       <w:szCs w:val="16"/>
     </w:rPr>
   </w:style>
+  <w:style w:type="character" w:customStyle="1" w:styleId="fontstyle01">
+    <w:name w:val="fontstyle01"/>
+    <w:basedOn w:val="DefaultParagraphFont"/>
+    <w:rsid w:val="00EE6505"/>
+    <w:rPr>
+      <w:rFonts w:ascii="TimesNewRomanPSMT" w:hAnsi="TimesNewRomanPSMT" w:hint="default"/>
+      <w:b w:val="0"/>
+      <w:bCs w:val="0"/>
+      <w:i w:val="0"/>
+      <w:iCs w:val="0"/>
+      <w:color w:val="000000"/>
+      <w:sz w:val="24"/>
+      <w:szCs w:val="24"/>
+    </w:rPr>
+  </w:style>
+  <w:style w:type="character" w:customStyle="1" w:styleId="Heading1Char">
+    <w:name w:val="Heading 1 Char"/>
+    <w:basedOn w:val="DefaultParagraphFont"/>
+    <w:link w:val="Heading1"/>
+    <w:uiPriority w:val="9"/>
+    <w:rsid w:val="00FE131D"/>
+    <w:rPr>
+      <w:rFonts w:asciiTheme="majorHAnsi" w:eastAsiaTheme="majorEastAsia" w:hAnsiTheme="majorHAnsi" w:cstheme="majorBidi"/>
+      <w:color w:val="244061" w:themeColor="accent1" w:themeShade="80"/>
+      <w:sz w:val="36"/>
+      <w:szCs w:val="36"/>
+    </w:rPr>
+  </w:style>
+  <w:style w:type="character" w:customStyle="1" w:styleId="Heading2Char">
+    <w:name w:val="Heading 2 Char"/>
+    <w:basedOn w:val="DefaultParagraphFont"/>
+    <w:link w:val="Heading2"/>
+    <w:uiPriority w:val="9"/>
+    <w:semiHidden/>
+    <w:rsid w:val="00FE131D"/>
+    <w:rPr>
+      <w:rFonts w:asciiTheme="majorHAnsi" w:eastAsiaTheme="majorEastAsia" w:hAnsiTheme="majorHAnsi" w:cstheme="majorBidi"/>
+      <w:color w:val="365F91" w:themeColor="accent1" w:themeShade="BF"/>
+      <w:sz w:val="32"/>
+      <w:szCs w:val="32"/>
+    </w:rPr>
+  </w:style>
+  <w:style w:type="character" w:customStyle="1" w:styleId="Heading3Char">
+    <w:name w:val="Heading 3 Char"/>
+    <w:basedOn w:val="DefaultParagraphFont"/>
+    <w:link w:val="Heading3"/>
+    <w:uiPriority w:val="9"/>
+    <w:semiHidden/>
+    <w:rsid w:val="00FE131D"/>
+    <w:rPr>
+      <w:rFonts w:asciiTheme="majorHAnsi" w:eastAsiaTheme="majorEastAsia" w:hAnsiTheme="majorHAnsi" w:cstheme="majorBidi"/>
+      <w:color w:val="365F91" w:themeColor="accent1" w:themeShade="BF"/>
+      <w:sz w:val="28"/>
+      <w:szCs w:val="28"/>
+    </w:rPr>
+  </w:style>
+  <w:style w:type="character" w:customStyle="1" w:styleId="Heading4Char">
+    <w:name w:val="Heading 4 Char"/>
+    <w:basedOn w:val="DefaultParagraphFont"/>
+    <w:link w:val="Heading4"/>
+    <w:uiPriority w:val="9"/>
+    <w:semiHidden/>
+    <w:rsid w:val="00FE131D"/>
+    <w:rPr>
+      <w:rFonts w:asciiTheme="majorHAnsi" w:eastAsiaTheme="majorEastAsia" w:hAnsiTheme="majorHAnsi" w:cstheme="majorBidi"/>
+      <w:color w:val="365F91" w:themeColor="accent1" w:themeShade="BF"/>
+      <w:sz w:val="24"/>
+      <w:szCs w:val="24"/>
+    </w:rPr>
+  </w:style>
+  <w:style w:type="character" w:customStyle="1" w:styleId="Heading5Char">
+    <w:name w:val="Heading 5 Char"/>
+    <w:basedOn w:val="DefaultParagraphFont"/>
+    <w:link w:val="Heading5"/>
+    <w:uiPriority w:val="9"/>
+    <w:semiHidden/>
+    <w:rsid w:val="00FE131D"/>
+    <w:rPr>
+      <w:rFonts w:asciiTheme="majorHAnsi" w:eastAsiaTheme="majorEastAsia" w:hAnsiTheme="majorHAnsi" w:cstheme="majorBidi"/>
+      <w:caps/>
+      <w:color w:val="365F91" w:themeColor="accent1" w:themeShade="BF"/>
+    </w:rPr>
+  </w:style>
+  <w:style w:type="character" w:customStyle="1" w:styleId="Heading6Char">
+    <w:name w:val="Heading 6 Char"/>
+    <w:basedOn w:val="DefaultParagraphFont"/>
+    <w:link w:val="Heading6"/>
+    <w:uiPriority w:val="9"/>
+    <w:semiHidden/>
+    <w:rsid w:val="00FE131D"/>
+    <w:rPr>
+      <w:rFonts w:asciiTheme="majorHAnsi" w:eastAsiaTheme="majorEastAsia" w:hAnsiTheme="majorHAnsi" w:cstheme="majorBidi"/>
+      <w:i/>
+      <w:iCs/>
+      <w:caps/>
+      <w:color w:val="244061" w:themeColor="accent1" w:themeShade="80"/>
+    </w:rPr>
+  </w:style>
+  <w:style w:type="character" w:customStyle="1" w:styleId="Heading7Char">
+    <w:name w:val="Heading 7 Char"/>
+    <w:basedOn w:val="DefaultParagraphFont"/>
+    <w:link w:val="Heading7"/>
+    <w:uiPriority w:val="9"/>
+    <w:semiHidden/>
+    <w:rsid w:val="00FE131D"/>
+    <w:rPr>
+      <w:rFonts w:asciiTheme="majorHAnsi" w:eastAsiaTheme="majorEastAsia" w:hAnsiTheme="majorHAnsi" w:cstheme="majorBidi"/>
+      <w:b/>
+      <w:bCs/>
+      <w:color w:val="244061" w:themeColor="accent1" w:themeShade="80"/>
+    </w:rPr>
+  </w:style>
+  <w:style w:type="character" w:customStyle="1" w:styleId="Heading8Char">
+    <w:name w:val="Heading 8 Char"/>
+    <w:basedOn w:val="DefaultParagraphFont"/>
+    <w:link w:val="Heading8"/>
+    <w:uiPriority w:val="9"/>
+    <w:semiHidden/>
+    <w:rsid w:val="00FE131D"/>
+    <w:rPr>
+      <w:rFonts w:asciiTheme="majorHAnsi" w:eastAsiaTheme="majorEastAsia" w:hAnsiTheme="majorHAnsi" w:cstheme="majorBidi"/>
+      <w:b/>
+      <w:bCs/>
+      <w:i/>
+      <w:iCs/>
+      <w:color w:val="244061" w:themeColor="accent1" w:themeShade="80"/>
+    </w:rPr>
+  </w:style>
+  <w:style w:type="character" w:customStyle="1" w:styleId="Heading9Char">
+    <w:name w:val="Heading 9 Char"/>
+    <w:basedOn w:val="DefaultParagraphFont"/>
+    <w:link w:val="Heading9"/>
+    <w:uiPriority w:val="9"/>
+    <w:semiHidden/>
+    <w:rsid w:val="00FE131D"/>
+    <w:rPr>
+      <w:rFonts w:asciiTheme="majorHAnsi" w:eastAsiaTheme="majorEastAsia" w:hAnsiTheme="majorHAnsi" w:cstheme="majorBidi"/>
+      <w:i/>
+      <w:iCs/>
+      <w:color w:val="244061" w:themeColor="accent1" w:themeShade="80"/>
+    </w:rPr>
+  </w:style>
+  <w:style w:type="paragraph" w:styleId="Caption">
+    <w:name w:val="caption"/>
+    <w:basedOn w:val="Normal"/>
+    <w:next w:val="Normal"/>
+    <w:uiPriority w:val="35"/>
+    <w:semiHidden/>
+    <w:unhideWhenUsed/>
+    <w:qFormat/>
+    <w:rsid w:val="00FE131D"/>
+    <w:pPr>
+      <w:spacing w:line="240" w:lineRule="auto"/>
+    </w:pPr>
+    <w:rPr>
+      <w:b/>
+      <w:bCs/>
+      <w:smallCaps/>
+      <w:color w:val="1F497D" w:themeColor="text2"/>
+    </w:rPr>
+  </w:style>
+  <w:style w:type="paragraph" w:styleId="Title">
+    <w:name w:val="Title"/>
+    <w:basedOn w:val="Normal"/>
+    <w:next w:val="Normal"/>
+    <w:link w:val="TitleChar"/>
+    <w:uiPriority w:val="10"/>
+    <w:qFormat/>
+    <w:rsid w:val="00FE131D"/>
+    <w:pPr>
+      <w:spacing w:after="0" w:line="204" w:lineRule="auto"/>
+      <w:contextualSpacing/>
+    </w:pPr>
+    <w:rPr>
+      <w:rFonts w:asciiTheme="majorHAnsi" w:eastAsiaTheme="majorEastAsia" w:hAnsiTheme="majorHAnsi" w:cstheme="majorBidi"/>
+      <w:caps/>
+      <w:color w:val="1F497D" w:themeColor="text2"/>
+      <w:spacing w:val="-15"/>
+      <w:sz w:val="72"/>
+      <w:szCs w:val="72"/>
+    </w:rPr>
+  </w:style>
+  <w:style w:type="character" w:customStyle="1" w:styleId="TitleChar">
+    <w:name w:val="Title Char"/>
+    <w:basedOn w:val="DefaultParagraphFont"/>
+    <w:link w:val="Title"/>
+    <w:uiPriority w:val="10"/>
+    <w:rsid w:val="00FE131D"/>
+    <w:rPr>
+      <w:rFonts w:asciiTheme="majorHAnsi" w:eastAsiaTheme="majorEastAsia" w:hAnsiTheme="majorHAnsi" w:cstheme="majorBidi"/>
+      <w:caps/>
+      <w:color w:val="1F497D" w:themeColor="text2"/>
+      <w:spacing w:val="-15"/>
+      <w:sz w:val="72"/>
+      <w:szCs w:val="72"/>
+    </w:rPr>
+  </w:style>
   <w:style w:type="paragraph" w:styleId="Subtitle">
     <w:name w:val="Subtitle"/>
     <w:basedOn w:val="Normal"/>
     <w:next w:val="Normal"/>
+    <w:link w:val="SubtitleChar"/>
     <w:uiPriority w:val="11"/>
     <w:qFormat/>
+    <w:rsid w:val="00FE131D"/>
     <w:pPr>
-      <w:keepNext/>
-      <w:keepLines/>
-      <w:spacing w:before="360" w:after="80"/>
+      <w:numPr>
+        <w:ilvl w:val="1"/>
+      </w:numPr>
+      <w:spacing w:after="240" w:line="240" w:lineRule="auto"/>
     </w:pPr>
     <w:rPr>
-      <w:rFonts w:ascii="Georgia" w:eastAsia="Georgia" w:hAnsi="Georgia" w:cs="Georgia"/>
+      <w:rFonts w:asciiTheme="majorHAnsi" w:eastAsiaTheme="majorEastAsia" w:hAnsiTheme="majorHAnsi" w:cstheme="majorBidi"/>
+      <w:color w:val="4F81BD" w:themeColor="accent1"/>
+      <w:sz w:val="28"/>
+      <w:szCs w:val="28"/>
+    </w:rPr>
+  </w:style>
+  <w:style w:type="character" w:customStyle="1" w:styleId="SubtitleChar">
+    <w:name w:val="Subtitle Char"/>
+    <w:basedOn w:val="DefaultParagraphFont"/>
+    <w:link w:val="Subtitle"/>
+    <w:uiPriority w:val="11"/>
+    <w:rsid w:val="00FE131D"/>
+    <w:rPr>
+      <w:rFonts w:asciiTheme="majorHAnsi" w:eastAsiaTheme="majorEastAsia" w:hAnsiTheme="majorHAnsi" w:cstheme="majorBidi"/>
+      <w:color w:val="4F81BD" w:themeColor="accent1"/>
+      <w:sz w:val="28"/>
+      <w:szCs w:val="28"/>
+    </w:rPr>
+  </w:style>
+  <w:style w:type="character" w:styleId="Strong">
+    <w:name w:val="Strong"/>
+    <w:basedOn w:val="DefaultParagraphFont"/>
+    <w:uiPriority w:val="22"/>
+    <w:qFormat/>
+    <w:rsid w:val="00FE131D"/>
+    <w:rPr>
+      <w:b/>
+      <w:bCs/>
+    </w:rPr>
+  </w:style>
+  <w:style w:type="character" w:styleId="Emphasis">
+    <w:name w:val="Emphasis"/>
+    <w:basedOn w:val="DefaultParagraphFont"/>
+    <w:uiPriority w:val="20"/>
+    <w:qFormat/>
+    <w:rsid w:val="00FE131D"/>
+    <w:rPr>
       <w:i/>
-      <w:color w:val="666666"/>
-      <w:sz w:val="48"/>
-      <w:szCs w:val="48"/>
-    </w:rPr>
+      <w:iCs/>
+    </w:rPr>
+  </w:style>
+  <w:style w:type="paragraph" w:styleId="NoSpacing">
+    <w:name w:val="No Spacing"/>
+    <w:uiPriority w:val="1"/>
+    <w:qFormat/>
+    <w:rsid w:val="00FE131D"/>
+    <w:pPr>
+      <w:spacing w:after="0" w:line="240" w:lineRule="auto"/>
+    </w:pPr>
+  </w:style>
+  <w:style w:type="paragraph" w:styleId="Quote">
+    <w:name w:val="Quote"/>
+    <w:basedOn w:val="Normal"/>
+    <w:next w:val="Normal"/>
+    <w:link w:val="QuoteChar"/>
+    <w:uiPriority w:val="29"/>
+    <w:qFormat/>
+    <w:rsid w:val="00FE131D"/>
+    <w:pPr>
+      <w:spacing w:before="120" w:after="120"/>
+      <w:ind w:left="720"/>
+    </w:pPr>
+    <w:rPr>
+      <w:color w:val="1F497D" w:themeColor="text2"/>
+      <w:sz w:val="24"/>
+      <w:szCs w:val="24"/>
+    </w:rPr>
+  </w:style>
+  <w:style w:type="character" w:customStyle="1" w:styleId="QuoteChar">
+    <w:name w:val="Quote Char"/>
+    <w:basedOn w:val="DefaultParagraphFont"/>
+    <w:link w:val="Quote"/>
+    <w:uiPriority w:val="29"/>
+    <w:rsid w:val="00FE131D"/>
+    <w:rPr>
+      <w:color w:val="1F497D" w:themeColor="text2"/>
+      <w:sz w:val="24"/>
+      <w:szCs w:val="24"/>
+    </w:rPr>
+  </w:style>
+  <w:style w:type="paragraph" w:styleId="IntenseQuote">
+    <w:name w:val="Intense Quote"/>
+    <w:basedOn w:val="Normal"/>
+    <w:next w:val="Normal"/>
+    <w:link w:val="IntenseQuoteChar"/>
+    <w:uiPriority w:val="30"/>
+    <w:qFormat/>
+    <w:rsid w:val="00FE131D"/>
+    <w:pPr>
+      <w:spacing w:before="100" w:beforeAutospacing="1" w:after="240" w:line="240" w:lineRule="auto"/>
+      <w:ind w:left="720"/>
+      <w:jc w:val="center"/>
+    </w:pPr>
+    <w:rPr>
+      <w:rFonts w:asciiTheme="majorHAnsi" w:eastAsiaTheme="majorEastAsia" w:hAnsiTheme="majorHAnsi" w:cstheme="majorBidi"/>
+      <w:color w:val="1F497D" w:themeColor="text2"/>
+      <w:spacing w:val="-6"/>
+      <w:sz w:val="32"/>
+      <w:szCs w:val="32"/>
+    </w:rPr>
+  </w:style>
+  <w:style w:type="character" w:customStyle="1" w:styleId="IntenseQuoteChar">
+    <w:name w:val="Intense Quote Char"/>
+    <w:basedOn w:val="DefaultParagraphFont"/>
+    <w:link w:val="IntenseQuote"/>
+    <w:uiPriority w:val="30"/>
+    <w:rsid w:val="00FE131D"/>
+    <w:rPr>
+      <w:rFonts w:asciiTheme="majorHAnsi" w:eastAsiaTheme="majorEastAsia" w:hAnsiTheme="majorHAnsi" w:cstheme="majorBidi"/>
+      <w:color w:val="1F497D" w:themeColor="text2"/>
+      <w:spacing w:val="-6"/>
+      <w:sz w:val="32"/>
+      <w:szCs w:val="32"/>
+    </w:rPr>
+  </w:style>
+  <w:style w:type="character" w:styleId="SubtleEmphasis">
+    <w:name w:val="Subtle Emphasis"/>
+    <w:basedOn w:val="DefaultParagraphFont"/>
+    <w:uiPriority w:val="19"/>
+    <w:qFormat/>
+    <w:rsid w:val="00FE131D"/>
+    <w:rPr>
+      <w:i/>
+      <w:iCs/>
+      <w:color w:val="595959" w:themeColor="text1" w:themeTint="A6"/>
+    </w:rPr>
+  </w:style>
+  <w:style w:type="character" w:styleId="IntenseEmphasis">
+    <w:name w:val="Intense Emphasis"/>
+    <w:basedOn w:val="DefaultParagraphFont"/>
+    <w:uiPriority w:val="21"/>
+    <w:qFormat/>
+    <w:rsid w:val="00FE131D"/>
+    <w:rPr>
+      <w:b/>
+      <w:bCs/>
+      <w:i/>
+      <w:iCs/>
+    </w:rPr>
+  </w:style>
+  <w:style w:type="character" w:styleId="SubtleReference">
+    <w:name w:val="Subtle Reference"/>
+    <w:basedOn w:val="DefaultParagraphFont"/>
+    <w:uiPriority w:val="31"/>
+    <w:qFormat/>
+    <w:rsid w:val="00FE131D"/>
+    <w:rPr>
+      <w:smallCaps/>
+      <w:color w:val="595959" w:themeColor="text1" w:themeTint="A6"/>
+      <w:u w:val="none" w:color="7F7F7F" w:themeColor="text1" w:themeTint="80"/>
+      <w:bdr w:val="none" w:sz="0" w:space="0" w:color="auto"/>
+    </w:rPr>
+  </w:style>
+  <w:style w:type="character" w:styleId="IntenseReference">
+    <w:name w:val="Intense Reference"/>
+    <w:basedOn w:val="DefaultParagraphFont"/>
+    <w:uiPriority w:val="32"/>
+    <w:qFormat/>
+    <w:rsid w:val="00FE131D"/>
+    <w:rPr>
+      <w:b/>
+      <w:bCs/>
+      <w:smallCaps/>
+      <w:color w:val="1F497D" w:themeColor="text2"/>
+      <w:u w:val="single"/>
+    </w:rPr>
+  </w:style>
+  <w:style w:type="character" w:styleId="BookTitle">
+    <w:name w:val="Book Title"/>
+    <w:basedOn w:val="DefaultParagraphFont"/>
+    <w:uiPriority w:val="33"/>
+    <w:qFormat/>
+    <w:rsid w:val="00FE131D"/>
+    <w:rPr>
+      <w:b/>
+      <w:bCs/>
+      <w:smallCaps/>
+      <w:spacing w:val="10"/>
+    </w:rPr>
+  </w:style>
+  <w:style w:type="paragraph" w:styleId="TOCHeading">
+    <w:name w:val="TOC Heading"/>
+    <w:basedOn w:val="Heading1"/>
+    <w:next w:val="Normal"/>
+    <w:uiPriority w:val="39"/>
+    <w:semiHidden/>
+    <w:unhideWhenUsed/>
+    <w:qFormat/>
+    <w:rsid w:val="00FE131D"/>
+    <w:pPr>
+      <w:outlineLvl w:val="9"/>
+    </w:pPr>
   </w:style>
   <w:style w:type="table" w:styleId="TableGrid">
     <w:name w:val="Table Grid"/>
     <w:basedOn w:val="TableNormal"/>
     <w:uiPriority w:val="39"/>
-    <w:rsid w:val="00A36581"/>
+    <w:rsid w:val="007422FC"/>
     <w:pPr>
       <w:spacing w:after="0" w:line="240" w:lineRule="auto"/>
     </w:pPr>
     <w:tblPr>
+      <w:tblBorders>
+        <w:top w:val="single" w:sz="4" w:space="0" w:color="auto"/>
+        <w:left w:val="single" w:sz="4" w:space="0" w:color="auto"/>
+        <w:bottom w:val="single" w:sz="4" w:space="0" w:color="auto"/>
+        <w:right w:val="single" w:sz="4" w:space="0" w:color="auto"/>
+        <w:insideH w:val="single" w:sz="4" w:space="0" w:color="auto"/>
+        <w:insideV w:val="single" w:sz="4" w:space="0" w:color="auto"/>
+      </w:tblBorders>
+    </w:tblPr>
+  </w:style>
+  <w:style w:type="paragraph" w:styleId="BodyText">
+    <w:name w:val="Body Text"/>
+    <w:basedOn w:val="Normal"/>
+    <w:link w:val="BodyTextChar"/>
+    <w:uiPriority w:val="1"/>
+    <w:qFormat/>
+    <w:rsid w:val="00A859E8"/>
+    <w:pPr>
+      <w:widowControl w:val="0"/>
+      <w:autoSpaceDE w:val="0"/>
+      <w:autoSpaceDN w:val="0"/>
+      <w:spacing w:after="0" w:line="240" w:lineRule="auto"/>
+    </w:pPr>
+    <w:rPr>
+      <w:rFonts w:ascii="Times New Roman" w:eastAsia="Times New Roman" w:hAnsi="Times New Roman" w:cs="Times New Roman"/>
+      <w:sz w:val="24"/>
+      <w:szCs w:val="24"/>
+      <w:lang w:val="id"/>
+    </w:rPr>
+  </w:style>
+  <w:style w:type="character" w:customStyle="1" w:styleId="BodyTextChar">
+    <w:name w:val="Body Text Char"/>
+    <w:basedOn w:val="DefaultParagraphFont"/>
+    <w:link w:val="BodyText"/>
+    <w:uiPriority w:val="1"/>
+    <w:rsid w:val="00A859E8"/>
+    <w:rPr>
+      <w:rFonts w:ascii="Times New Roman" w:eastAsia="Times New Roman" w:hAnsi="Times New Roman" w:cs="Times New Roman"/>
+      <w:sz w:val="24"/>
+      <w:szCs w:val="24"/>
+      <w:lang w:val="id"/>
+    </w:rPr>
+  </w:style>
+  <w:style w:type="character" w:styleId="UnresolvedMention">
+    <w:name w:val="Unresolved Mention"/>
+    <w:basedOn w:val="DefaultParagraphFont"/>
+    <w:uiPriority w:val="99"/>
+    <w:semiHidden/>
+    <w:unhideWhenUsed/>
+    <w:rsid w:val="00B468CB"/>
+    <w:rPr>
+      <w:color w:val="605E5C"/>
+      <w:shd w:val="clear" w:color="auto" w:fill="E1DFDD"/>
+    </w:rPr>
+  </w:style>
+  <w:style w:type="table" w:customStyle="1" w:styleId="TableGrid1">
+    <w:name w:val="Table Grid1"/>
+    <w:basedOn w:val="TableNormal"/>
+    <w:next w:val="TableGrid"/>
+    <w:uiPriority w:val="39"/>
+    <w:rsid w:val="00B468CB"/>
+    <w:pPr>
+      <w:spacing w:after="0" w:line="240" w:lineRule="auto"/>
+    </w:pPr>
+    <w:rPr>
+      <w:rFonts w:eastAsia="MS Mincho" w:cs="Arial"/>
+    </w:rPr>
+    <w:tblPr>
+      <w:tblInd w:w="0" w:type="nil"/>
       <w:tblBorders>
         <w:top w:val="single" w:sz="4" w:space="0" w:color="auto"/>
         <w:left w:val="single" w:sz="4" w:space="0" w:color="auto"/>
@@ -2802,16 +3461,13 @@
 </file>
 
 <file path=customXml/item1.xml><?xml version="1.0" encoding="utf-8"?>
-<go:gDocsCustomXmlDataStorage xmlns:go="http://customooxmlschemas.google.com/" xmlns:r="http://schemas.openxmlformats.org/officeDocument/2006/relationships" uri="GoogleDocsCustomDataVersion2">
-  <go:docsCustomData xmlns:go="http://customooxmlschemas.google.com/" roundtripDataSignature="AMtx7mh18dBg6NN2T0yxCS4aSsuHY3573A==">CgMxLjAaJQoBMBIgCh4IB0IaCg9UaW1lcyBOZXcgUm9tYW4SB0d1bmdzdWgaJQoBMRIgCh4IB0IaCg9UaW1lcyBOZXcgUm9tYW4SB0d1bmdzdWgyCGguZ2pkZ3hzOAByITFuSDlrMlZCN2V5THFoUEF4bjhidzZCckRSc3k3V0RNZQ==</go:docsCustomData>
-</go:gDocsCustomXmlDataStorage>
+<b:Sources xmlns:b="http://schemas.openxmlformats.org/officeDocument/2006/bibliography" xmlns="http://schemas.openxmlformats.org/officeDocument/2006/bibliography" SelectedStyle="\APASixthEditionOfficeOnline.xsl" StyleName="APA" Version="6"/>
 </file>
 
 <file path=customXml/itemProps1.xml><?xml version="1.0" encoding="utf-8"?>
-<ds:datastoreItem xmlns:ds="http://schemas.openxmlformats.org/officeDocument/2006/customXml" ds:itemID="{11111111-1234-1234-1234-123412341234}">
+<ds:datastoreItem xmlns:ds="http://schemas.openxmlformats.org/officeDocument/2006/customXml" ds:itemID="{69D1CFFE-E2C6-416A-A02F-A1E11574B147}">
   <ds:schemaRefs>
-    <ds:schemaRef ds:uri="http://customooxmlschemas.google.com/"/>
-    <ds:schemaRef ds:uri="http://schemas.openxmlformats.org/officeDocument/2006/relationships"/>
+    <ds:schemaRef ds:uri="http://schemas.openxmlformats.org/officeDocument/2006/bibliography"/>
   </ds:schemaRefs>
 </ds:datastoreItem>
 </file>
</xml_diff>